<commit_message>
Aggiornati class docs e candidate.py
</commit_message>
<xml_diff>
--- a/docs/uml/04_class/class_analysis.docx
+++ b/docs/uml/04_class/class_analysis.docx
@@ -71,15 +71,7 @@
         <w:t>The collaboration along the</w:t>
       </w:r>
       <w:r>
-        <w:t xml:space="preserve"> </w:t>
-      </w:r>
-      <w:proofErr w:type="spellStart"/>
-      <w:r>
-        <w:t>pieline</w:t>
-      </w:r>
-      <w:proofErr w:type="spellEnd"/>
-      <w:r>
-        <w:t>: data loading</w:t>
+        <w:t xml:space="preserve"> pieline: data loading</w:t>
       </w:r>
       <w:r>
         <w:t xml:space="preserve"> → </w:t>
@@ -147,13 +139,8 @@
           <w:numId w:val="21"/>
         </w:numPr>
       </w:pPr>
-      <w:proofErr w:type="gramStart"/>
-      <w:r>
-        <w:t>id :</w:t>
-      </w:r>
-      <w:proofErr w:type="gramEnd"/>
-      <w:r>
-        <w:t xml:space="preserve"> String – </w:t>
+      <w:r>
+        <w:t xml:space="preserve">id : String – </w:t>
       </w:r>
       <w:r>
         <w:t>Unique identifier.</w:t>
@@ -167,29 +154,11 @@
           <w:numId w:val="21"/>
         </w:numPr>
       </w:pPr>
-      <w:proofErr w:type="spellStart"/>
-      <w:r>
-        <w:t>frequency_</w:t>
-      </w:r>
-      <w:proofErr w:type="gramStart"/>
-      <w:r>
-        <w:t>hz</w:t>
-      </w:r>
-      <w:proofErr w:type="spellEnd"/>
-      <w:r>
-        <w:t xml:space="preserve"> :</w:t>
-      </w:r>
-      <w:proofErr w:type="gramEnd"/>
-      <w:r>
-        <w:t xml:space="preserve"> float – </w:t>
-      </w:r>
-      <w:proofErr w:type="spellStart"/>
-      <w:r>
-        <w:t>Center</w:t>
-      </w:r>
-      <w:proofErr w:type="spellEnd"/>
-      <w:r>
-        <w:t xml:space="preserve"> frequency of the signal in Hz.</w:t>
+      <w:r>
+        <w:t xml:space="preserve">frequency_hz : float – </w:t>
+      </w:r>
+      <w:r>
+        <w:t>Center frequency of the signal in Hz.</w:t>
       </w:r>
     </w:p>
     <w:p>
@@ -200,21 +169,8 @@
           <w:numId w:val="21"/>
         </w:numPr>
       </w:pPr>
-      <w:proofErr w:type="spellStart"/>
-      <w:r>
-        <w:t>drift_hz_</w:t>
-      </w:r>
-      <w:proofErr w:type="gramStart"/>
-      <w:r>
-        <w:t>s</w:t>
-      </w:r>
-      <w:proofErr w:type="spellEnd"/>
-      <w:r>
-        <w:t xml:space="preserve"> :</w:t>
-      </w:r>
-      <w:proofErr w:type="gramEnd"/>
-      <w:r>
-        <w:t xml:space="preserve"> float – </w:t>
+      <w:r>
+        <w:t xml:space="preserve">drift_hz_s : float – </w:t>
       </w:r>
       <w:r>
         <w:t>D</w:t>
@@ -231,7 +187,6 @@
           <w:numId w:val="21"/>
         </w:numPr>
       </w:pPr>
-      <w:proofErr w:type="gramStart"/>
       <w:r>
         <w:t>cadence</w:t>
       </w:r>
@@ -239,11 +194,7 @@
         <w:t xml:space="preserve"> </w:t>
       </w:r>
       <w:r>
-        <w:t>:</w:t>
-      </w:r>
-      <w:proofErr w:type="gramEnd"/>
-      <w:r>
-        <w:t xml:space="preserve"> array – Cadence tensor, typically of shape (6, H, W), containing the 6 ON/OFF panels.</w:t>
+        <w:t>: array – Cadence tensor, typically of shape (6, H, W), containing the 6 ON/OFF panels.</w:t>
       </w:r>
     </w:p>
     <w:p>
@@ -254,24 +205,14 @@
           <w:numId w:val="21"/>
         </w:numPr>
       </w:pPr>
-      <w:proofErr w:type="spellStart"/>
-      <w:r>
-        <w:t>source_</w:t>
-      </w:r>
-      <w:proofErr w:type="gramStart"/>
-      <w:r>
-        <w:t>path</w:t>
-      </w:r>
-      <w:proofErr w:type="spellEnd"/>
+      <w:r>
+        <w:t>source_path</w:t>
+      </w:r>
       <w:r>
         <w:t xml:space="preserve"> </w:t>
       </w:r>
       <w:r>
-        <w:t>:</w:t>
-      </w:r>
-      <w:proofErr w:type="gramEnd"/>
-      <w:r>
-        <w:t xml:space="preserve"> Path – Path to the source file for traceability.</w:t>
+        <w:t>: Path – Path to the source file for traceability.</w:t>
       </w:r>
     </w:p>
     <w:p>
@@ -282,16 +223,11 @@
           <w:numId w:val="21"/>
         </w:numPr>
       </w:pPr>
-      <w:proofErr w:type="gramStart"/>
       <w:r>
         <w:t xml:space="preserve">category </w:t>
       </w:r>
       <w:r>
-        <w:t>:</w:t>
-      </w:r>
-      <w:proofErr w:type="gramEnd"/>
-      <w:r>
-        <w:t xml:space="preserve"> int - </w:t>
+        <w:t xml:space="preserve">: int - </w:t>
       </w:r>
       <w:r>
         <w:t>Diagnostic helper storing the argmax category assigned by the density filter.</w:t>
@@ -305,32 +241,14 @@
           <w:numId w:val="21"/>
         </w:numPr>
       </w:pPr>
-      <w:proofErr w:type="spellStart"/>
-      <w:r>
-        <w:t>density_</w:t>
-      </w:r>
-      <w:proofErr w:type="gramStart"/>
-      <w:r>
-        <w:t>score</w:t>
-      </w:r>
-      <w:proofErr w:type="spellEnd"/>
+      <w:r>
+        <w:t>density_score</w:t>
+      </w:r>
       <w:r>
         <w:t xml:space="preserve"> </w:t>
       </w:r>
       <w:r>
-        <w:t>:</w:t>
-      </w:r>
-      <w:proofErr w:type="gramEnd"/>
-      <w:r>
-        <w:t xml:space="preserve"> float – Score calculated by the </w:t>
-      </w:r>
-      <w:proofErr w:type="spellStart"/>
-      <w:r>
-        <w:t>DensityFilter</w:t>
-      </w:r>
-      <w:proofErr w:type="spellEnd"/>
-      <w:r>
-        <w:t>.</w:t>
+        <w:t>: float – Score calculated by the DensityFilter.</w:t>
       </w:r>
     </w:p>
     <w:p>
@@ -341,32 +259,14 @@
           <w:numId w:val="21"/>
         </w:numPr>
       </w:pPr>
-      <w:proofErr w:type="spellStart"/>
-      <w:r>
-        <w:t>frequency_</w:t>
-      </w:r>
-      <w:proofErr w:type="gramStart"/>
-      <w:r>
-        <w:t>score</w:t>
-      </w:r>
-      <w:proofErr w:type="spellEnd"/>
+      <w:r>
+        <w:t>frequency_score</w:t>
+      </w:r>
       <w:r>
         <w:t xml:space="preserve"> </w:t>
       </w:r>
       <w:r>
-        <w:t>:</w:t>
-      </w:r>
-      <w:proofErr w:type="gramEnd"/>
-      <w:r>
-        <w:t xml:space="preserve"> float – Score calculated by the </w:t>
-      </w:r>
-      <w:proofErr w:type="spellStart"/>
-      <w:r>
-        <w:t>FrequencyFilter</w:t>
-      </w:r>
-      <w:proofErr w:type="spellEnd"/>
-      <w:r>
-        <w:t>.</w:t>
+        <w:t>: float – Score calculated by the FrequencyFilter.</w:t>
       </w:r>
     </w:p>
     <w:p>
@@ -377,32 +277,44 @@
           <w:numId w:val="21"/>
         </w:numPr>
       </w:pPr>
-      <w:proofErr w:type="spellStart"/>
-      <w:r>
-        <w:t>similarity_</w:t>
-      </w:r>
-      <w:proofErr w:type="gramStart"/>
-      <w:r>
-        <w:t>score</w:t>
-      </w:r>
-      <w:proofErr w:type="spellEnd"/>
+      <w:r>
+        <w:t>similarity_score</w:t>
+      </w:r>
       <w:r>
         <w:t xml:space="preserve"> </w:t>
       </w:r>
       <w:r>
-        <w:t>:</w:t>
-      </w:r>
-      <w:proofErr w:type="gramEnd"/>
-      <w:r>
-        <w:t xml:space="preserve"> float – Score calculated by the </w:t>
-      </w:r>
-      <w:proofErr w:type="spellStart"/>
-      <w:r>
-        <w:t>SimilarityFilter</w:t>
-      </w:r>
-      <w:proofErr w:type="spellEnd"/>
-      <w:r>
-        <w:t>.</w:t>
+        <w:t>: float – Score calculated by the SimilarityFilter.</w:t>
+      </w:r>
+    </w:p>
+    <w:p>
+      <w:pPr>
+        <w:pStyle w:val="Paragrafoelenco"/>
+        <w:numPr>
+          <w:ilvl w:val="0"/>
+          <w:numId w:val="21"/>
+        </w:numPr>
+      </w:pPr>
+      <w:r>
+        <w:t>target : str</w:t>
+      </w:r>
+      <w:r>
+        <w:t xml:space="preserve"> – indentifier of the observed source used to stratify candidates during the ranking phase.</w:t>
+      </w:r>
+    </w:p>
+    <w:p>
+      <w:pPr>
+        <w:pStyle w:val="Paragrafoelenco"/>
+        <w:numPr>
+          <w:ilvl w:val="0"/>
+          <w:numId w:val="21"/>
+        </w:numPr>
+      </w:pPr>
+      <w:r>
+        <w:t>band : str – frequency band label (C, K) derived from the candidate central frequency and used for band</w:t>
+      </w:r>
+      <w:r>
+        <w:t xml:space="preserve"> specific ranking.</w:t>
       </w:r>
     </w:p>
     <w:p>
@@ -427,21 +339,8 @@
           <w:numId w:val="55"/>
         </w:numPr>
       </w:pPr>
-      <w:proofErr w:type="spellStart"/>
-      <w:r>
-        <w:t>to_</w:t>
-      </w:r>
-      <w:proofErr w:type="gramStart"/>
-      <w:r>
-        <w:t>summary</w:t>
-      </w:r>
-      <w:proofErr w:type="spellEnd"/>
-      <w:r>
-        <w:t>(</w:t>
-      </w:r>
-      <w:proofErr w:type="gramEnd"/>
-      <w:r>
-        <w:t xml:space="preserve">): </w:t>
+      <w:r>
+        <w:t xml:space="preserve">to_summary(): </w:t>
       </w:r>
       <w:r>
         <w:t>Returns a dictionary containing metadata, all computed scores, and the source path.</w:t>
@@ -455,27 +354,14 @@
           <w:numId w:val="55"/>
         </w:numPr>
       </w:pPr>
-      <w:proofErr w:type="spellStart"/>
-      <w:r>
-        <w:t>set_category</w:t>
-      </w:r>
-      <w:proofErr w:type="spellEnd"/>
-      <w:r>
-        <w:t>(value</w:t>
-      </w:r>
-      <w:proofErr w:type="gramStart"/>
-      <w:r>
-        <w:t>)</w:t>
+      <w:r>
+        <w:t>set_category(value)</w:t>
       </w:r>
       <w:r>
         <w:t xml:space="preserve"> </w:t>
       </w:r>
       <w:r>
-        <w:t>:</w:t>
-      </w:r>
-      <w:proofErr w:type="gramEnd"/>
-      <w:r>
-        <w:t xml:space="preserve"> Sets the diagnostic density argmax category.</w:t>
+        <w:t>: Sets the diagnostic density argmax category.</w:t>
       </w:r>
     </w:p>
     <w:p>
@@ -486,13 +372,8 @@
           <w:numId w:val="55"/>
         </w:numPr>
       </w:pPr>
-      <w:proofErr w:type="spellStart"/>
-      <w:r>
-        <w:t>set_density_score</w:t>
-      </w:r>
-      <w:proofErr w:type="spellEnd"/>
-      <w:r>
-        <w:t>(value): Sets the density score.</w:t>
+      <w:r>
+        <w:t>set_density_score(value): Sets the density score.</w:t>
       </w:r>
     </w:p>
     <w:p>
@@ -503,13 +384,9 @@
           <w:numId w:val="55"/>
         </w:numPr>
       </w:pPr>
-      <w:proofErr w:type="spellStart"/>
-      <w:r>
-        <w:t>set_frequency_score</w:t>
-      </w:r>
-      <w:proofErr w:type="spellEnd"/>
-      <w:r>
-        <w:t>(value): Sets the frequency score.</w:t>
+      <w:r>
+        <w:lastRenderedPageBreak/>
+        <w:t>set_frequency_score(value): Sets the frequency score.</w:t>
       </w:r>
     </w:p>
     <w:p>
@@ -520,27 +397,15 @@
           <w:numId w:val="55"/>
         </w:numPr>
       </w:pPr>
-      <w:proofErr w:type="spellStart"/>
-      <w:r>
-        <w:t>set_similarity_score</w:t>
-      </w:r>
-      <w:proofErr w:type="spellEnd"/>
-      <w:r>
-        <w:t>(value): Sets the similarity score.</w:t>
+      <w:r>
+        <w:t>set_similarity_score(value): Sets the similarity score.</w:t>
       </w:r>
     </w:p>
     <w:p>
       <w:pPr>
         <w:pStyle w:val="Titolo3"/>
-        <w:rPr>
-          <w:lang w:val="it-IT"/>
-        </w:rPr>
-      </w:pPr>
-      <w:r>
-        <w:rPr>
-          <w:lang w:val="it-IT"/>
-        </w:rPr>
-        <w:lastRenderedPageBreak/>
+      </w:pPr>
+      <w:r>
         <w:t>Dataset</w:t>
       </w:r>
     </w:p>
@@ -569,15 +434,7 @@
         </w:numPr>
       </w:pPr>
       <w:r>
-        <w:t>Loading synthetic cadence tensors (.</w:t>
-      </w:r>
-      <w:proofErr w:type="spellStart"/>
-      <w:r>
-        <w:t>npy</w:t>
-      </w:r>
-      <w:proofErr w:type="spellEnd"/>
-      <w:r>
-        <w:t>) and mapping them to metadata from cadences_log.csv.</w:t>
+        <w:t>Loading synthetic cadence tensors (.npy) and mapping them to metadata from cadences_log.csv.</w:t>
       </w:r>
     </w:p>
     <w:p>
@@ -611,19 +468,11 @@
           <w:lang w:val="it-IT"/>
         </w:rPr>
       </w:pPr>
-      <w:proofErr w:type="spellStart"/>
       <w:r>
         <w:rPr>
           <w:lang w:val="it-IT"/>
         </w:rPr>
-        <w:t>Attributes</w:t>
-      </w:r>
-      <w:proofErr w:type="spellEnd"/>
-      <w:r>
-        <w:rPr>
-          <w:lang w:val="it-IT"/>
-        </w:rPr>
-        <w:t>:</w:t>
+        <w:t>Attributes:</w:t>
       </w:r>
     </w:p>
     <w:p>
@@ -634,13 +483,8 @@
           <w:numId w:val="56"/>
         </w:numPr>
       </w:pPr>
-      <w:proofErr w:type="spellStart"/>
-      <w:r>
-        <w:t>png_dir</w:t>
-      </w:r>
-      <w:proofErr w:type="spellEnd"/>
-      <w:r>
-        <w:t>: Root directory containing the real PNG waterfall plots.</w:t>
+      <w:r>
+        <w:t>png_dir: Root directory containing the real PNG waterfall plots.</w:t>
       </w:r>
     </w:p>
     <w:p>
@@ -651,13 +495,8 @@
           <w:numId w:val="56"/>
         </w:numPr>
       </w:pPr>
-      <w:proofErr w:type="spellStart"/>
-      <w:r>
-        <w:t>rx</w:t>
-      </w:r>
-      <w:proofErr w:type="spellEnd"/>
-      <w:r>
-        <w:t>: Regex for parsing metadata from filenames (target, drift rate, frequency, etc.).</w:t>
+      <w:r>
+        <w:t>rx: Regex for parsing metadata from filenames (target, drift rate, frequency, etc.).</w:t>
       </w:r>
     </w:p>
     <w:p>
@@ -682,21 +521,8 @@
           <w:numId w:val="57"/>
         </w:numPr>
       </w:pPr>
-      <w:proofErr w:type="spellStart"/>
-      <w:r>
-        <w:t>load_simulated_cadences</w:t>
-      </w:r>
-      <w:proofErr w:type="spellEnd"/>
-      <w:r>
-        <w:t>(</w:t>
-      </w:r>
-      <w:proofErr w:type="spellStart"/>
-      <w:r>
-        <w:t>cadences_dir</w:t>
-      </w:r>
-      <w:proofErr w:type="spellEnd"/>
-      <w:r>
-        <w:t>): Reads simulated files.</w:t>
+      <w:r>
+        <w:t>load_simulated_cadences(cadences_dir): Reads simulated files.</w:t>
       </w:r>
     </w:p>
     <w:p>
@@ -710,11 +536,9 @@
       <w:r>
         <w:t>load(</w:t>
       </w:r>
-      <w:proofErr w:type="spellStart"/>
       <w:r>
         <w:t>png_dir</w:t>
       </w:r>
-      <w:proofErr w:type="spellEnd"/>
       <w:r>
         <w:t>): Loads PNG files.</w:t>
       </w:r>
@@ -727,21 +551,8 @@
           <w:numId w:val="57"/>
         </w:numPr>
       </w:pPr>
-      <w:proofErr w:type="spellStart"/>
-      <w:r>
-        <w:t>crop_</w:t>
-      </w:r>
-      <w:proofErr w:type="gramStart"/>
-      <w:r>
-        <w:t>box</w:t>
-      </w:r>
-      <w:proofErr w:type="spellEnd"/>
-      <w:r>
-        <w:t>(</w:t>
-      </w:r>
-      <w:proofErr w:type="gramEnd"/>
-      <w:r>
-        <w:t>w, h): Crops images to remove margins.</w:t>
+      <w:r>
+        <w:t>crop_box(w, h): Crops images to remove margins.</w:t>
       </w:r>
     </w:p>
     <w:p>
@@ -752,49 +563,16 @@
           <w:numId w:val="57"/>
         </w:numPr>
       </w:pPr>
-      <w:proofErr w:type="spellStart"/>
-      <w:r>
-        <w:t>preprocessing_spectrogram</w:t>
-      </w:r>
-      <w:proofErr w:type="spellEnd"/>
-      <w:r>
-        <w:t>(data): Preprocesses the signal with time normalization, DC spike removal, and bandpass correction using B-splines.</w:t>
+      <w:r>
+        <w:t>preprocessing_spectrogram(data): Preprocesses the signal with time normalization, DC spike removal, and bandpass correction using B-splines.</w:t>
       </w:r>
     </w:p>
     <w:p>
       <w:pPr>
         <w:pStyle w:val="Titolo3"/>
-        <w:rPr>
-          <w:lang w:val="it-IT"/>
-        </w:rPr>
-      </w:pPr>
-      <w:proofErr w:type="spellStart"/>
-      <w:r>
-        <w:rPr>
-          <w:lang w:val="it-IT"/>
-        </w:rPr>
-        <w:t>IFilter</w:t>
-      </w:r>
-      <w:proofErr w:type="spellEnd"/>
-      <w:r>
-        <w:rPr>
-          <w:lang w:val="it-IT"/>
-        </w:rPr>
-        <w:t xml:space="preserve"> &lt;&lt;</w:t>
-      </w:r>
-      <w:proofErr w:type="spellStart"/>
-      <w:r>
-        <w:rPr>
-          <w:lang w:val="it-IT"/>
-        </w:rPr>
-        <w:t>interface</w:t>
-      </w:r>
-      <w:proofErr w:type="spellEnd"/>
-      <w:r>
-        <w:rPr>
-          <w:lang w:val="it-IT"/>
-        </w:rPr>
-        <w:t>&gt;&gt;</w:t>
+      </w:pPr>
+      <w:r>
+        <w:t>IFilter &lt;&lt;interface&gt;&gt;</w:t>
       </w:r>
     </w:p>
     <w:p>
@@ -803,6 +581,30 @@
       </w:pPr>
       <w:r>
         <w:t>Common interface for all filtering modules.</w:t>
+      </w:r>
+    </w:p>
+    <w:p>
+      <w:pPr>
+        <w:ind w:left="360"/>
+      </w:pPr>
+      <w:r>
+        <w:t>Responsibilities:</w:t>
+      </w:r>
+    </w:p>
+    <w:p>
+      <w:pPr>
+        <w:ind w:left="360"/>
+      </w:pPr>
+      <w:r>
+        <w:t>Defining the contract for model training and candidate scoring.</w:t>
+      </w:r>
+    </w:p>
+    <w:p>
+      <w:pPr>
+        <w:ind w:left="360"/>
+      </w:pPr>
+      <w:r>
+        <w:t>Managing logic for saving and loading models from disk.</w:t>
       </w:r>
     </w:p>
     <w:p>
@@ -812,57 +614,11 @@
           <w:lang w:val="it-IT"/>
         </w:rPr>
       </w:pPr>
-      <w:proofErr w:type="spellStart"/>
       <w:r>
         <w:rPr>
           <w:lang w:val="it-IT"/>
         </w:rPr>
-        <w:t>Responsibilities</w:t>
-      </w:r>
-      <w:proofErr w:type="spellEnd"/>
-      <w:r>
-        <w:rPr>
-          <w:lang w:val="it-IT"/>
-        </w:rPr>
-        <w:t>:</w:t>
-      </w:r>
-    </w:p>
-    <w:p>
-      <w:pPr>
-        <w:ind w:left="360"/>
-      </w:pPr>
-      <w:r>
-        <w:t>Defining the contract for model training and candidate scoring.</w:t>
-      </w:r>
-    </w:p>
-    <w:p>
-      <w:pPr>
-        <w:ind w:left="360"/>
-      </w:pPr>
-      <w:r>
-        <w:t>Managing logic for saving and loading models from disk.</w:t>
-      </w:r>
-    </w:p>
-    <w:p>
-      <w:pPr>
-        <w:ind w:left="360"/>
-        <w:rPr>
-          <w:lang w:val="it-IT"/>
-        </w:rPr>
-      </w:pPr>
-      <w:proofErr w:type="spellStart"/>
-      <w:r>
-        <w:rPr>
-          <w:lang w:val="it-IT"/>
-        </w:rPr>
-        <w:t>Attributes</w:t>
-      </w:r>
-      <w:proofErr w:type="spellEnd"/>
-      <w:r>
-        <w:rPr>
-          <w:lang w:val="it-IT"/>
-        </w:rPr>
-        <w:t>:</w:t>
+        <w:t>Attributes:</w:t>
       </w:r>
     </w:p>
     <w:p>
@@ -885,13 +641,8 @@
           <w:numId w:val="58"/>
         </w:numPr>
       </w:pPr>
-      <w:proofErr w:type="spellStart"/>
-      <w:r>
-        <w:t>random_state</w:t>
-      </w:r>
-      <w:proofErr w:type="spellEnd"/>
-      <w:r>
-        <w:t>: Seed for reproducibility.</w:t>
+      <w:r>
+        <w:t>random_state: Seed for reproducibility.</w:t>
       </w:r>
     </w:p>
     <w:p>
@@ -931,33 +682,11 @@
           <w:lang w:val="it-IT"/>
         </w:rPr>
       </w:pPr>
-      <w:proofErr w:type="spellStart"/>
       <w:r>
         <w:rPr>
           <w:lang w:val="it-IT"/>
         </w:rPr>
-        <w:t>calculate</w:t>
-      </w:r>
-      <w:proofErr w:type="spellEnd"/>
-      <w:r>
-        <w:rPr>
-          <w:lang w:val="it-IT"/>
-        </w:rPr>
-        <w:t xml:space="preserve">(candidate): </w:t>
-      </w:r>
-      <w:proofErr w:type="spellStart"/>
-      <w:r>
-        <w:rPr>
-          <w:lang w:val="it-IT"/>
-        </w:rPr>
-        <w:t>Calculates</w:t>
-      </w:r>
-      <w:proofErr w:type="spellEnd"/>
-      <w:r>
-        <w:rPr>
-          <w:lang w:val="it-IT"/>
-        </w:rPr>
-        <w:t xml:space="preserve"> a score for a Candidate.</w:t>
+        <w:t>calculate(candidate): Calculates a score for a Candidate.</w:t>
       </w:r>
     </w:p>
     <w:p>
@@ -968,54 +697,18 @@
           <w:numId w:val="59"/>
         </w:numPr>
       </w:pPr>
-      <w:proofErr w:type="spellStart"/>
-      <w:r>
-        <w:t>save_</w:t>
-      </w:r>
-      <w:proofErr w:type="gramStart"/>
-      <w:r>
-        <w:t>models</w:t>
-      </w:r>
-      <w:proofErr w:type="spellEnd"/>
-      <w:r>
-        <w:t>(</w:t>
-      </w:r>
-      <w:proofErr w:type="gramEnd"/>
-      <w:r>
-        <w:t xml:space="preserve">) / </w:t>
-      </w:r>
-      <w:proofErr w:type="spellStart"/>
-      <w:r>
-        <w:t>load_</w:t>
-      </w:r>
-      <w:proofErr w:type="gramStart"/>
-      <w:r>
-        <w:t>models</w:t>
-      </w:r>
-      <w:proofErr w:type="spellEnd"/>
-      <w:r>
-        <w:t>(</w:t>
-      </w:r>
-      <w:proofErr w:type="gramEnd"/>
-      <w:r>
-        <w:t>): Model persistence management.</w:t>
+      <w:r>
+        <w:t>save_models() / load_models(): Model persistence management.</w:t>
       </w:r>
     </w:p>
     <w:p>
       <w:pPr>
         <w:pStyle w:val="Titolo3"/>
-        <w:rPr>
-          <w:lang w:val="it-IT"/>
-        </w:rPr>
-      </w:pPr>
-      <w:proofErr w:type="spellStart"/>
-      <w:r>
-        <w:rPr>
-          <w:lang w:val="it-IT"/>
-        </w:rPr>
+      </w:pPr>
+      <w:r>
+        <w:lastRenderedPageBreak/>
         <w:t>DensityFilter</w:t>
       </w:r>
-      <w:proofErr w:type="spellEnd"/>
     </w:p>
     <w:p>
       <w:pPr>
@@ -1032,20 +725,11 @@
           <w:lang w:val="it-IT"/>
         </w:rPr>
       </w:pPr>
-      <w:proofErr w:type="spellStart"/>
       <w:r>
         <w:rPr>
           <w:lang w:val="it-IT"/>
         </w:rPr>
-        <w:lastRenderedPageBreak/>
-        <w:t>Responsibilities</w:t>
-      </w:r>
-      <w:proofErr w:type="spellEnd"/>
-      <w:r>
-        <w:rPr>
-          <w:lang w:val="it-IT"/>
-        </w:rPr>
-        <w:t>:</w:t>
+        <w:t>Responsibilities:</w:t>
       </w:r>
     </w:p>
     <w:p>
@@ -1091,19 +775,11 @@
           <w:lang w:val="it-IT"/>
         </w:rPr>
       </w:pPr>
-      <w:proofErr w:type="spellStart"/>
       <w:r>
         <w:rPr>
           <w:lang w:val="it-IT"/>
         </w:rPr>
-        <w:t>Attributes</w:t>
-      </w:r>
-      <w:proofErr w:type="spellEnd"/>
-      <w:r>
-        <w:rPr>
-          <w:lang w:val="it-IT"/>
-        </w:rPr>
-        <w:t>:</w:t>
+        <w:t>Attributes:</w:t>
       </w:r>
     </w:p>
     <w:p>
@@ -1117,35 +793,18 @@
           <w:lang w:val="it-IT"/>
         </w:rPr>
       </w:pPr>
-      <w:proofErr w:type="spellStart"/>
       <w:r>
         <w:rPr>
           <w:lang w:val="it-IT"/>
         </w:rPr>
-        <w:t>umap_model_path</w:t>
-      </w:r>
-      <w:proofErr w:type="spellEnd"/>
+        <w:t>umap_model_path, kde_models_dir</w:t>
+      </w:r>
       <w:r>
         <w:rPr>
           <w:lang w:val="it-IT"/>
         </w:rPr>
         <w:t xml:space="preserve">, </w:t>
       </w:r>
-      <w:proofErr w:type="spellStart"/>
-      <w:r>
-        <w:rPr>
-          <w:lang w:val="it-IT"/>
-        </w:rPr>
-        <w:t>kde_models_dir</w:t>
-      </w:r>
-      <w:proofErr w:type="spellEnd"/>
-      <w:r>
-        <w:rPr>
-          <w:lang w:val="it-IT"/>
-        </w:rPr>
-        <w:t xml:space="preserve">, </w:t>
-      </w:r>
-      <w:proofErr w:type="spellStart"/>
       <w:r>
         <w:rPr>
           <w:lang w:val="it-IT"/>
@@ -1158,7 +817,6 @@
         </w:rPr>
         <w:t>_Z_train</w:t>
       </w:r>
-      <w:proofErr w:type="spellEnd"/>
       <w:r>
         <w:rPr>
           <w:lang w:val="it-IT"/>
@@ -1169,14 +827,7 @@
         <w:rPr>
           <w:lang w:val="it-IT"/>
         </w:rPr>
-        <w:t xml:space="preserve"> </w:t>
-      </w:r>
-      <w:proofErr w:type="spellStart"/>
-      <w:r>
-        <w:rPr>
-          <w:lang w:val="it-IT"/>
-        </w:rPr>
-        <w:t>cache_</w:t>
+        <w:t xml:space="preserve"> cache_</w:t>
       </w:r>
       <w:r>
         <w:rPr>
@@ -1184,7 +835,6 @@
         </w:rPr>
         <w:t>y_train</w:t>
       </w:r>
-      <w:proofErr w:type="spellEnd"/>
       <w:r>
         <w:rPr>
           <w:lang w:val="it-IT"/>
@@ -1195,16 +845,8 @@
         <w:rPr>
           <w:lang w:val="it-IT"/>
         </w:rPr>
-        <w:t xml:space="preserve"> </w:t>
-      </w:r>
-      <w:proofErr w:type="spellStart"/>
-      <w:r>
-        <w:rPr>
-          <w:lang w:val="it-IT"/>
-        </w:rPr>
-        <w:t>cache_Z_val</w:t>
-      </w:r>
-      <w:proofErr w:type="spellEnd"/>
+        <w:t xml:space="preserve"> cache_Z_val</w:t>
+      </w:r>
       <w:r>
         <w:rPr>
           <w:lang w:val="it-IT"/>
@@ -1215,16 +857,8 @@
         <w:rPr>
           <w:lang w:val="it-IT"/>
         </w:rPr>
-        <w:t xml:space="preserve"> </w:t>
-      </w:r>
-      <w:proofErr w:type="spellStart"/>
-      <w:r>
-        <w:rPr>
-          <w:lang w:val="it-IT"/>
-        </w:rPr>
-        <w:t>cache_y_val</w:t>
-      </w:r>
-      <w:proofErr w:type="spellEnd"/>
+        <w:t xml:space="preserve"> cache_y_val</w:t>
+      </w:r>
       <w:r>
         <w:rPr>
           <w:lang w:val="it-IT"/>
@@ -1235,14 +869,7 @@
         <w:rPr>
           <w:lang w:val="it-IT"/>
         </w:rPr>
-        <w:t xml:space="preserve"> </w:t>
-      </w:r>
-      <w:proofErr w:type="spellStart"/>
-      <w:r>
-        <w:rPr>
-          <w:lang w:val="it-IT"/>
-        </w:rPr>
-        <w:t>cache_</w:t>
+        <w:t xml:space="preserve"> cache_</w:t>
       </w:r>
       <w:r>
         <w:rPr>
@@ -1250,26 +877,11 @@
         </w:rPr>
         <w:t>probs</w:t>
       </w:r>
-      <w:proofErr w:type="spellEnd"/>
       <w:r>
         <w:rPr>
           <w:lang w:val="it-IT"/>
         </w:rPr>
-        <w:t xml:space="preserve">: Model storage </w:t>
-      </w:r>
-      <w:proofErr w:type="spellStart"/>
-      <w:r>
-        <w:rPr>
-          <w:lang w:val="it-IT"/>
-        </w:rPr>
-        <w:t>paths</w:t>
-      </w:r>
-      <w:proofErr w:type="spellEnd"/>
-      <w:r>
-        <w:rPr>
-          <w:lang w:val="it-IT"/>
-        </w:rPr>
-        <w:t>.</w:t>
+        <w:t>: Model storage paths.</w:t>
       </w:r>
     </w:p>
     <w:p>
@@ -1280,29 +892,8 @@
           <w:numId w:val="60"/>
         </w:numPr>
       </w:pPr>
-      <w:proofErr w:type="spellStart"/>
-      <w:r>
-        <w:t>n_neighbors</w:t>
-      </w:r>
-      <w:proofErr w:type="spellEnd"/>
-      <w:r>
-        <w:t xml:space="preserve">, </w:t>
-      </w:r>
-      <w:proofErr w:type="spellStart"/>
-      <w:r>
-        <w:t>min_dist</w:t>
-      </w:r>
-      <w:proofErr w:type="spellEnd"/>
-      <w:r>
-        <w:t xml:space="preserve">, metric, </w:t>
-      </w:r>
-      <w:proofErr w:type="spellStart"/>
-      <w:r>
-        <w:t>n_components</w:t>
-      </w:r>
-      <w:proofErr w:type="spellEnd"/>
-      <w:r>
-        <w:t>: UMAP hyperparameters.</w:t>
+      <w:r>
+        <w:t>n_neighbors, min_dist, metric, n_components: UMAP hyperparameters.</w:t>
       </w:r>
     </w:p>
     <w:p>
@@ -1325,21 +916,8 @@
           <w:numId w:val="60"/>
         </w:numPr>
       </w:pPr>
-      <w:proofErr w:type="spellStart"/>
-      <w:r>
-        <w:t>kde_bandwidth</w:t>
-      </w:r>
-      <w:proofErr w:type="spellEnd"/>
-      <w:r>
-        <w:t xml:space="preserve">, </w:t>
-      </w:r>
-      <w:proofErr w:type="spellStart"/>
-      <w:r>
-        <w:t>kde_kernel</w:t>
-      </w:r>
-      <w:proofErr w:type="spellEnd"/>
-      <w:r>
-        <w:t>: KDE parameters.</w:t>
+      <w:r>
+        <w:t>kde_bandwidth, kde_kernel: KDE parameters.</w:t>
       </w:r>
     </w:p>
     <w:p>
@@ -1350,13 +928,8 @@
           <w:numId w:val="60"/>
         </w:numPr>
       </w:pPr>
-      <w:proofErr w:type="spellStart"/>
-      <w:r>
-        <w:t>kdes</w:t>
-      </w:r>
-      <w:proofErr w:type="spellEnd"/>
-      <w:r>
-        <w:t>: Dictionary of KDE models for each simulation category.</w:t>
+      <w:r>
+        <w:t>kdes: Dictionary of KDE models for each simulation category.</w:t>
       </w:r>
     </w:p>
     <w:p>
@@ -1381,13 +954,8 @@
           <w:numId w:val="61"/>
         </w:numPr>
       </w:pPr>
-      <w:proofErr w:type="spellStart"/>
-      <w:r>
-        <w:t>derive_category</w:t>
-      </w:r>
-      <w:proofErr w:type="spellEnd"/>
-      <w:r>
-        <w:t>(meta): Maps simulation metadata to the internal category index (0-63).</w:t>
+      <w:r>
+        <w:t>derive_category(meta): Maps simulation metadata to the internal category index (0-63).</w:t>
       </w:r>
     </w:p>
     <w:p>
@@ -1398,51 +966,17 @@
           <w:numId w:val="61"/>
         </w:numPr>
       </w:pPr>
-      <w:proofErr w:type="spellStart"/>
-      <w:r>
-        <w:t>validate_on_</w:t>
-      </w:r>
-      <w:proofErr w:type="gramStart"/>
-      <w:r>
-        <w:t>val</w:t>
-      </w:r>
-      <w:proofErr w:type="spellEnd"/>
-      <w:r>
-        <w:t>(</w:t>
-      </w:r>
-      <w:proofErr w:type="spellStart"/>
-      <w:proofErr w:type="gramEnd"/>
-      <w:r>
-        <w:t>Z_val</w:t>
-      </w:r>
-      <w:proofErr w:type="spellEnd"/>
-      <w:r>
-        <w:t xml:space="preserve">, </w:t>
-      </w:r>
-      <w:proofErr w:type="spellStart"/>
-      <w:r>
-        <w:t>y_val</w:t>
-      </w:r>
-      <w:proofErr w:type="spellEnd"/>
-      <w:r>
-        <w:t>): Runs validation diagnostics.</w:t>
+      <w:r>
+        <w:t>validate_on_val(Z_val, y_val): Runs validation diagnostics.</w:t>
       </w:r>
     </w:p>
     <w:p>
       <w:pPr>
         <w:pStyle w:val="Titolo3"/>
-        <w:rPr>
-          <w:lang w:val="it-IT"/>
-        </w:rPr>
-      </w:pPr>
-      <w:proofErr w:type="spellStart"/>
-      <w:r>
-        <w:rPr>
-          <w:lang w:val="it-IT"/>
-        </w:rPr>
+      </w:pPr>
+      <w:r>
         <w:t>FrequencyFilter</w:t>
       </w:r>
-      <w:proofErr w:type="spellEnd"/>
     </w:p>
     <w:p>
       <w:pPr>
@@ -1459,19 +993,11 @@
           <w:lang w:val="it-IT"/>
         </w:rPr>
       </w:pPr>
-      <w:proofErr w:type="spellStart"/>
       <w:r>
         <w:rPr>
           <w:lang w:val="it-IT"/>
         </w:rPr>
-        <w:t>Responsibilities</w:t>
-      </w:r>
-      <w:proofErr w:type="spellEnd"/>
-      <w:r>
-        <w:rPr>
-          <w:lang w:val="it-IT"/>
-        </w:rPr>
-        <w:t>:</w:t>
+        <w:t>Responsibilities:</w:t>
       </w:r>
     </w:p>
     <w:p>
@@ -1482,13 +1008,8 @@
           <w:numId w:val="71"/>
         </w:numPr>
       </w:pPr>
-      <w:proofErr w:type="spellStart"/>
-      <w:r>
-        <w:t>Modeling</w:t>
-      </w:r>
-      <w:proofErr w:type="spellEnd"/>
-      <w:r>
-        <w:t xml:space="preserve"> frequency distributions for </w:t>
+      <w:r>
+        <w:t xml:space="preserve">Modeling frequency distributions for </w:t>
       </w:r>
       <w:r>
         <w:t>bands L, S, and 10cm.</w:t>
@@ -1513,19 +1034,11 @@
           <w:lang w:val="it-IT"/>
         </w:rPr>
       </w:pPr>
-      <w:proofErr w:type="spellStart"/>
       <w:r>
         <w:rPr>
           <w:lang w:val="it-IT"/>
         </w:rPr>
-        <w:t>Attributes</w:t>
-      </w:r>
-      <w:proofErr w:type="spellEnd"/>
-      <w:r>
-        <w:rPr>
-          <w:lang w:val="it-IT"/>
-        </w:rPr>
-        <w:t>:</w:t>
+        <w:t>Attributes:</w:t>
       </w:r>
     </w:p>
     <w:p>
@@ -1536,13 +1049,8 @@
           <w:numId w:val="62"/>
         </w:numPr>
       </w:pPr>
-      <w:proofErr w:type="spellStart"/>
-      <w:r>
-        <w:t>gmm_model_path</w:t>
-      </w:r>
-      <w:proofErr w:type="spellEnd"/>
-      <w:r>
-        <w:t>: File containing the GMM ensembles.</w:t>
+      <w:r>
+        <w:t>gmm_model_path: File containing the GMM ensembles.</w:t>
       </w:r>
     </w:p>
     <w:p>
@@ -1565,21 +1073,8 @@
           <w:numId w:val="62"/>
         </w:numPr>
       </w:pPr>
-      <w:proofErr w:type="spellStart"/>
-      <w:r>
-        <w:t>n_bags</w:t>
-      </w:r>
-      <w:proofErr w:type="spellEnd"/>
-      <w:r>
-        <w:t xml:space="preserve">, </w:t>
-      </w:r>
-      <w:proofErr w:type="spellStart"/>
-      <w:r>
-        <w:t>bag_size</w:t>
-      </w:r>
-      <w:proofErr w:type="spellEnd"/>
-      <w:r>
-        <w:t>: Bagging parameters.</w:t>
+      <w:r>
+        <w:t>n_bags, bag_size: Bagging parameters.</w:t>
       </w:r>
     </w:p>
     <w:p>
@@ -1590,13 +1085,8 @@
           <w:numId w:val="62"/>
         </w:numPr>
       </w:pPr>
-      <w:proofErr w:type="spellStart"/>
-      <w:r>
-        <w:t>gmm_ensembles</w:t>
-      </w:r>
-      <w:proofErr w:type="spellEnd"/>
-      <w:r>
-        <w:t>: List of GMMs for each band.</w:t>
+      <w:r>
+        <w:t>gmm_ensembles: List of GMMs for each band.</w:t>
       </w:r>
     </w:p>
     <w:p>
@@ -1607,21 +1097,8 @@
           <w:numId w:val="62"/>
         </w:numPr>
       </w:pPr>
-      <w:proofErr w:type="spellStart"/>
-      <w:r>
-        <w:t>raw_min</w:t>
-      </w:r>
-      <w:proofErr w:type="spellEnd"/>
-      <w:r>
-        <w:t xml:space="preserve"> / </w:t>
-      </w:r>
-      <w:proofErr w:type="spellStart"/>
-      <w:r>
-        <w:t>raw_max</w:t>
-      </w:r>
-      <w:proofErr w:type="spellEnd"/>
-      <w:r>
-        <w:t>: float – Global values used to linearly scale the raw anomaly scores into a standardized [0, 1] range.</w:t>
+      <w:r>
+        <w:t>raw_min / raw_max: float – Global values used to linearly scale the raw anomaly scores into a standardized [0, 1] range.</w:t>
       </w:r>
       <w:r>
         <w:t xml:space="preserve"> </w:t>
@@ -1643,13 +1120,8 @@
           <w:numId w:val="63"/>
         </w:numPr>
       </w:pPr>
-      <w:proofErr w:type="spellStart"/>
-      <w:r>
-        <w:t>extract_band</w:t>
-      </w:r>
-      <w:proofErr w:type="spellEnd"/>
-      <w:r>
-        <w:t xml:space="preserve">(candidate): </w:t>
+      <w:r>
+        <w:t xml:space="preserve">extract_band(candidate): </w:t>
       </w:r>
       <w:r>
         <w:t xml:space="preserve">A static helper method that assigns a candidate to </w:t>
@@ -1669,13 +1141,9 @@
           <w:numId w:val="63"/>
         </w:numPr>
       </w:pPr>
-      <w:proofErr w:type="spellStart"/>
-      <w:r>
-        <w:t>raw_density_score</w:t>
-      </w:r>
-      <w:proofErr w:type="spellEnd"/>
-      <w:r>
-        <w:t xml:space="preserve">(candidate): </w:t>
+      <w:r>
+        <w:lastRenderedPageBreak/>
+        <w:t xml:space="preserve">raw_density_score(candidate): </w:t>
       </w:r>
       <w:r>
         <w:t>An internal method that calculates the raw anomaly value defined as 1 / mean\_pdf</w:t>
@@ -1695,33 +1163,17 @@
           <w:numId w:val="63"/>
         </w:numPr>
       </w:pPr>
-      <w:proofErr w:type="spellStart"/>
-      <w:r>
-        <w:t>compute_scaling</w:t>
-      </w:r>
-      <w:proofErr w:type="spellEnd"/>
-      <w:r>
-        <w:t>(</w:t>
-      </w:r>
-      <w:proofErr w:type="spellStart"/>
-      <w:r>
-        <w:t>band_to_candidates</w:t>
-      </w:r>
-      <w:proofErr w:type="spellEnd"/>
-      <w:r>
-        <w:t>): An internal routine that determines the minimum and maximum raw scores to calibrate the [0, 1] normalization.</w:t>
+      <w:r>
+        <w:t>compute_scaling(band_to_candidates): An internal routine that determines the minimum and maximum raw scores to calibrate the [0, 1] normalization.</w:t>
       </w:r>
     </w:p>
     <w:p>
       <w:pPr>
         <w:pStyle w:val="Titolo3"/>
       </w:pPr>
-      <w:proofErr w:type="spellStart"/>
-      <w:r>
-        <w:lastRenderedPageBreak/>
+      <w:r>
         <w:t>SimilarityFilter</w:t>
       </w:r>
-      <w:proofErr w:type="spellEnd"/>
     </w:p>
     <w:p>
       <w:pPr>
@@ -1760,15 +1212,7 @@
         </w:numPr>
       </w:pPr>
       <w:r>
-        <w:t xml:space="preserve">Embedding </w:t>
-      </w:r>
-      <w:proofErr w:type="spellStart"/>
-      <w:r>
-        <w:t>downsampled</w:t>
-      </w:r>
-      <w:proofErr w:type="spellEnd"/>
-      <w:r>
-        <w:t xml:space="preserve"> panels into a low-dimensional UMAP space to calculate geometric distances between observation slots.</w:t>
+        <w:t>Embedding downsampled panels into a low-dimensional UMAP space to calculate geometric distances between observation slots.</w:t>
       </w:r>
     </w:p>
     <w:p>
@@ -1802,19 +1246,11 @@
           <w:lang w:val="it-IT"/>
         </w:rPr>
       </w:pPr>
-      <w:proofErr w:type="spellStart"/>
       <w:r>
         <w:rPr>
           <w:lang w:val="it-IT"/>
         </w:rPr>
-        <w:t>Attributes</w:t>
-      </w:r>
-      <w:proofErr w:type="spellEnd"/>
-      <w:r>
-        <w:rPr>
-          <w:lang w:val="it-IT"/>
-        </w:rPr>
-        <w:t>:</w:t>
+        <w:t>Attributes:</w:t>
       </w:r>
     </w:p>
     <w:p>
@@ -1825,13 +1261,8 @@
           <w:numId w:val="63"/>
         </w:numPr>
       </w:pPr>
-      <w:proofErr w:type="spellStart"/>
-      <w:r>
-        <w:t>umap_model_path</w:t>
-      </w:r>
-      <w:proofErr w:type="spellEnd"/>
-      <w:r>
-        <w:t>: Path – The file system path used to persist the trained UMAP model.</w:t>
+      <w:r>
+        <w:t>umap_model_path: Path – The file system path used to persist the trained UMAP model.</w:t>
       </w:r>
     </w:p>
     <w:p>
@@ -1842,13 +1273,8 @@
           <w:numId w:val="63"/>
         </w:numPr>
       </w:pPr>
-      <w:proofErr w:type="spellStart"/>
-      <w:r>
-        <w:t>umap</w:t>
-      </w:r>
-      <w:proofErr w:type="spellEnd"/>
-      <w:r>
-        <w:t>: UMAP – The manifold learning instance used to transform panel pixels into embeddings.</w:t>
+      <w:r>
+        <w:t>umap: UMAP – The manifold learning instance used to transform panel pixels into embeddings.</w:t>
       </w:r>
     </w:p>
     <w:p>
@@ -1859,29 +1285,8 @@
           <w:numId w:val="63"/>
         </w:numPr>
       </w:pPr>
-      <w:proofErr w:type="spellStart"/>
-      <w:r>
-        <w:t>n_neighbors</w:t>
-      </w:r>
-      <w:proofErr w:type="spellEnd"/>
-      <w:r>
-        <w:t>, _</w:t>
-      </w:r>
-      <w:proofErr w:type="spellStart"/>
-      <w:r>
-        <w:t>min_dist</w:t>
-      </w:r>
-      <w:proofErr w:type="spellEnd"/>
-      <w:r>
-        <w:t>, _metric, _</w:t>
-      </w:r>
-      <w:proofErr w:type="spellStart"/>
-      <w:r>
-        <w:t>n_components</w:t>
-      </w:r>
-      <w:proofErr w:type="spellEnd"/>
-      <w:r>
-        <w:t>: UMAP hyperparameters used to configure the embedding space.</w:t>
+      <w:r>
+        <w:t>n_neighbors, _min_dist, _metric, _n_components: UMAP hyperparameters used to configure the embedding space.</w:t>
       </w:r>
     </w:p>
     <w:p>
@@ -1892,21 +1297,8 @@
           <w:numId w:val="63"/>
         </w:numPr>
       </w:pPr>
-      <w:proofErr w:type="spellStart"/>
-      <w:r>
-        <w:t>raw_min</w:t>
-      </w:r>
-      <w:proofErr w:type="spellEnd"/>
-      <w:r>
-        <w:t xml:space="preserve"> / _</w:t>
-      </w:r>
-      <w:proofErr w:type="spellStart"/>
-      <w:r>
-        <w:t>raw_max</w:t>
-      </w:r>
-      <w:proofErr w:type="spellEnd"/>
-      <w:r>
-        <w:t>: float | None – Global range of raw similarity ratios used for linear scaling.</w:t>
+      <w:r>
+        <w:t>raw_min / _raw_max: float | None – Global range of raw similarity ratios used for linear scaling.</w:t>
       </w:r>
     </w:p>
     <w:p>
@@ -1917,21 +1309,8 @@
           <w:numId w:val="63"/>
         </w:numPr>
       </w:pPr>
-      <w:proofErr w:type="spellStart"/>
-      <w:r>
-        <w:t>freq_downsample</w:t>
-      </w:r>
-      <w:proofErr w:type="spellEnd"/>
-      <w:r>
-        <w:t xml:space="preserve"> / _</w:t>
-      </w:r>
-      <w:proofErr w:type="spellStart"/>
-      <w:r>
-        <w:t>time_downsample</w:t>
-      </w:r>
-      <w:proofErr w:type="spellEnd"/>
-      <w:r>
-        <w:t>: int – Constant factors (5 and 2) used to reduce panel dimensions before embedding.</w:t>
+      <w:r>
+        <w:t>freq_downsample / _time_downsample: int – Constant factors (5 and 2) used to reduce panel dimensions before embedding.</w:t>
       </w:r>
     </w:p>
     <w:p>
@@ -1942,21 +1321,8 @@
           <w:numId w:val="63"/>
         </w:numPr>
       </w:pPr>
-      <w:proofErr w:type="spellStart"/>
-      <w:r>
-        <w:t>on_indices</w:t>
-      </w:r>
-      <w:proofErr w:type="spellEnd"/>
-      <w:r>
-        <w:t xml:space="preserve"> / _</w:t>
-      </w:r>
-      <w:proofErr w:type="spellStart"/>
-      <w:r>
-        <w:t>off_indices</w:t>
-      </w:r>
-      <w:proofErr w:type="spellEnd"/>
-      <w:r>
-        <w:t>: List[int] – Fixed indices (ON: [0, 2, 4], OFF: [1, 3, 5]) defining the observation pattern.</w:t>
+      <w:r>
+        <w:t>on_indices / _off_indices: List[int] – Fixed indices (ON: [0, 2, 4], OFF: [1, 3, 5]) defining the observation pattern.</w:t>
       </w:r>
     </w:p>
     <w:p>
@@ -1981,21 +1347,8 @@
           <w:numId w:val="76"/>
         </w:numPr>
       </w:pPr>
-      <w:proofErr w:type="spellStart"/>
-      <w:r>
-        <w:t>compute_</w:t>
-      </w:r>
-      <w:proofErr w:type="gramStart"/>
-      <w:r>
-        <w:t>scaling</w:t>
-      </w:r>
-      <w:proofErr w:type="spellEnd"/>
-      <w:r>
-        <w:t>(</w:t>
-      </w:r>
-      <w:proofErr w:type="gramEnd"/>
-      <w:r>
-        <w:t>Candidate)</w:t>
+      <w:r>
+        <w:t>compute_scaling(Candidate)</w:t>
       </w:r>
       <w:r>
         <w:t xml:space="preserve"> - </w:t>
@@ -2012,48 +1365,17 @@
           <w:numId w:val="65"/>
         </w:numPr>
       </w:pPr>
-      <w:proofErr w:type="spellStart"/>
-      <w:r>
-        <w:t>raw_similarity_score</w:t>
-      </w:r>
-      <w:proofErr w:type="spellEnd"/>
-      <w:r>
-        <w:t xml:space="preserve">(candidate): </w:t>
-      </w:r>
-      <w:r>
-        <w:t xml:space="preserve">Internal method that calculates the raw ratio defined as </w:t>
-      </w:r>
-      <w:proofErr w:type="spellStart"/>
-      <w:r>
-        <w:t>mean_</w:t>
-      </w:r>
-      <w:proofErr w:type="gramStart"/>
-      <w:r>
-        <w:t>dist</w:t>
-      </w:r>
-      <w:proofErr w:type="spellEnd"/>
+      <w:r>
+        <w:t xml:space="preserve">raw_similarity_score(candidate): </w:t>
+      </w:r>
+      <w:r>
+        <w:t>Internal method that calculates the raw ratio defined as mean_dist</w:t>
+      </w:r>
       <w:r>
         <w:t>(</w:t>
       </w:r>
-      <w:proofErr w:type="gramEnd"/>
-      <w:r>
-        <w:t xml:space="preserve">ON-OFF) / </w:t>
-      </w:r>
-      <w:proofErr w:type="spellStart"/>
-      <w:r>
-        <w:t>mean_</w:t>
-      </w:r>
-      <w:proofErr w:type="gramStart"/>
-      <w:r>
-        <w:t>dist</w:t>
-      </w:r>
-      <w:proofErr w:type="spellEnd"/>
-      <w:r>
-        <w:t>}(</w:t>
-      </w:r>
-      <w:proofErr w:type="gramEnd"/>
-      <w:r>
-        <w:t>ON-ON) + epsilon).</w:t>
+      <w:r>
+        <w:t>ON-OFF) / mean_dist}(ON-ON) + epsilon).</w:t>
       </w:r>
     </w:p>
     <w:p>
@@ -2064,34 +1386,16 @@
           <w:numId w:val="65"/>
         </w:numPr>
       </w:pPr>
-      <w:proofErr w:type="spellStart"/>
-      <w:r>
-        <w:t>downsample_cadence</w:t>
-      </w:r>
-      <w:proofErr w:type="spellEnd"/>
-      <w:r>
-        <w:t xml:space="preserve">(cadence): Internal routine that performs block-averaging to </w:t>
-      </w:r>
-      <w:proofErr w:type="spellStart"/>
-      <w:r>
-        <w:t>downsample</w:t>
-      </w:r>
-      <w:proofErr w:type="spellEnd"/>
-      <w:r>
-        <w:t xml:space="preserve"> the (6, 16, 80) input tensor to (6, 8, 16).</w:t>
+      <w:r>
+        <w:t>downsample_cadence(cadence): Internal routine that performs block-averaging to downsample the (6, 16, 80) input tensor to (6, 8, 16).</w:t>
       </w:r>
     </w:p>
     <w:p>
       <w:pPr>
         <w:pStyle w:val="Titolo3"/>
-        <w:rPr>
-          <w:lang w:val="it-IT"/>
-        </w:rPr>
-      </w:pPr>
-      <w:r>
-        <w:rPr>
-          <w:lang w:val="it-IT"/>
-        </w:rPr>
+      </w:pPr>
+      <w:r>
+        <w:lastRenderedPageBreak/>
         <w:t>Ranker</w:t>
       </w:r>
     </w:p>
@@ -2100,100 +1404,15 @@
         <w:ind w:left="360"/>
       </w:pPr>
       <w:r>
-        <w:t>Handles the prioritization and ranking of candidates.</w:t>
+        <w:t>Handles the prioritization and sampling of scored candidates following the paper logic.</w:t>
       </w:r>
     </w:p>
     <w:p>
       <w:pPr>
         <w:ind w:left="360"/>
-        <w:rPr>
-          <w:lang w:val="it-IT"/>
-        </w:rPr>
-      </w:pPr>
-      <w:proofErr w:type="spellStart"/>
-      <w:r>
-        <w:rPr>
-          <w:lang w:val="it-IT"/>
-        </w:rPr>
-        <w:t>Responsibilities</w:t>
-      </w:r>
-      <w:proofErr w:type="spellEnd"/>
-      <w:r>
-        <w:rPr>
-          <w:lang w:val="it-IT"/>
-        </w:rPr>
-        <w:t>:</w:t>
-      </w:r>
-    </w:p>
-    <w:p>
-      <w:pPr>
-        <w:pStyle w:val="Paragrafoelenco"/>
-        <w:numPr>
-          <w:ilvl w:val="0"/>
-          <w:numId w:val="74"/>
-        </w:numPr>
-      </w:pPr>
-      <w:r>
-        <w:t>Sorting candidates based on frequency and similarity scores.</w:t>
-      </w:r>
-    </w:p>
-    <w:p>
-      <w:pPr>
-        <w:pStyle w:val="Paragrafoelenco"/>
-        <w:numPr>
-          <w:ilvl w:val="0"/>
-          <w:numId w:val="74"/>
-        </w:numPr>
-      </w:pPr>
-      <w:r>
-        <w:lastRenderedPageBreak/>
-        <w:t xml:space="preserve">Selecting the combined </w:t>
-      </w:r>
-      <w:proofErr w:type="gramStart"/>
-      <w:r>
-        <w:rPr>
-          <w:b/>
-          <w:bCs/>
-        </w:rPr>
-        <w:t>Top-K</w:t>
-      </w:r>
-      <w:proofErr w:type="gramEnd"/>
-      <w:r>
-        <w:t xml:space="preserve"> candidates.</w:t>
-      </w:r>
-    </w:p>
-    <w:p>
-      <w:pPr>
-        <w:pStyle w:val="Paragrafoelenco"/>
-        <w:numPr>
-          <w:ilvl w:val="0"/>
-          <w:numId w:val="74"/>
-        </w:numPr>
-      </w:pPr>
-      <w:r>
-        <w:t>Generating a random control sample for validation.</w:t>
-      </w:r>
-    </w:p>
-    <w:p>
-      <w:pPr>
-        <w:ind w:left="360"/>
-        <w:rPr>
-          <w:lang w:val="it-IT"/>
-        </w:rPr>
-      </w:pPr>
-      <w:proofErr w:type="spellStart"/>
-      <w:r>
-        <w:rPr>
-          <w:lang w:val="it-IT"/>
-        </w:rPr>
-        <w:t>Attributes</w:t>
-      </w:r>
-      <w:proofErr w:type="spellEnd"/>
-      <w:r>
-        <w:rPr>
-          <w:lang w:val="it-IT"/>
-        </w:rPr>
-        <w:t>:</w:t>
+      </w:pPr>
+      <w:r>
+        <w:t>Responsibilities:</w:t>
       </w:r>
     </w:p>
     <w:p>
@@ -2204,21 +1423,18 @@
           <w:numId w:val="65"/>
         </w:numPr>
       </w:pPr>
-      <w:proofErr w:type="spellStart"/>
-      <w:r>
-        <w:t>top_percentile_freq</w:t>
-      </w:r>
-      <w:proofErr w:type="spellEnd"/>
-      <w:r>
-        <w:t xml:space="preserve">, </w:t>
-      </w:r>
-      <w:proofErr w:type="spellStart"/>
-      <w:r>
-        <w:t>top_percentile_sim</w:t>
-      </w:r>
-      <w:proofErr w:type="spellEnd"/>
-      <w:r>
-        <w:t>: Percentiles for score selection.</w:t>
+      <w:r>
+        <w:t xml:space="preserve">Selecting top candidates based on </w:t>
+      </w:r>
+      <w:r>
+        <w:rPr>
+          <w:b/>
+          <w:bCs/>
+        </w:rPr>
+        <w:t>frequency score percentile</w:t>
+      </w:r>
+      <w:r>
+        <w:t>.</w:t>
       </w:r>
     </w:p>
     <w:p>
@@ -2229,13 +1445,62 @@
           <w:numId w:val="65"/>
         </w:numPr>
       </w:pPr>
-      <w:proofErr w:type="spellStart"/>
-      <w:r>
-        <w:t>top_combined</w:t>
-      </w:r>
-      <w:proofErr w:type="spellEnd"/>
-      <w:r>
-        <w:t>: Number of final candidates to export (K).</w:t>
+      <w:r>
+        <w:t xml:space="preserve">Selecting top candidates based on </w:t>
+      </w:r>
+      <w:r>
+        <w:rPr>
+          <w:b/>
+          <w:bCs/>
+        </w:rPr>
+        <w:t>similarity score percentile</w:t>
+      </w:r>
+      <w:r>
+        <w:t>.</w:t>
+      </w:r>
+    </w:p>
+    <w:p>
+      <w:pPr>
+        <w:pStyle w:val="Paragrafoelenco"/>
+        <w:numPr>
+          <w:ilvl w:val="0"/>
+          <w:numId w:val="65"/>
+        </w:numPr>
+      </w:pPr>
+      <w:r>
+        <w:t xml:space="preserve">Selecting a </w:t>
+      </w:r>
+      <w:r>
+        <w:rPr>
+          <w:b/>
+          <w:bCs/>
+        </w:rPr>
+        <w:t>combined Top-K</w:t>
+      </w:r>
+      <w:r>
+        <w:t xml:space="preserve"> using equal weighting of scores.</w:t>
+      </w:r>
+    </w:p>
+    <w:p>
+      <w:pPr>
+        <w:pStyle w:val="Paragrafoelenco"/>
+        <w:numPr>
+          <w:ilvl w:val="0"/>
+          <w:numId w:val="65"/>
+        </w:numPr>
+      </w:pPr>
+      <w:r>
+        <w:t xml:space="preserve">Generating a </w:t>
+      </w:r>
+      <w:r>
+        <w:rPr>
+          <w:b/>
+          <w:bCs/>
+        </w:rPr>
+        <w:t>random control sample</w:t>
+      </w:r>
+      <w:r>
+        <w:t xml:space="preserve"> for validation.</w:t>
       </w:r>
     </w:p>
     <w:p>
@@ -2249,7 +1514,7 @@
         <w:rPr>
           <w:lang w:val="it-IT"/>
         </w:rPr>
-        <w:t>Methods:</w:t>
+        <w:t>Attributes:</w:t>
       </w:r>
     </w:p>
     <w:p>
@@ -2257,16 +1522,11 @@
         <w:pStyle w:val="Paragrafoelenco"/>
         <w:numPr>
           <w:ilvl w:val="0"/>
-          <w:numId w:val="66"/>
+          <w:numId w:val="65"/>
         </w:numPr>
       </w:pPr>
-      <w:proofErr w:type="spellStart"/>
-      <w:r>
-        <w:t>select_top_k_combined</w:t>
-      </w:r>
-      <w:proofErr w:type="spellEnd"/>
-      <w:r>
-        <w:t>(candidates): Aggregates scores and returns the best K candidates.</w:t>
+      <w:r>
+        <w:t>top_percentile_freq : float — percentile for frequency-based selection</w:t>
       </w:r>
     </w:p>
     <w:p>
@@ -2274,46 +1534,35 @@
         <w:pStyle w:val="Paragrafoelenco"/>
         <w:numPr>
           <w:ilvl w:val="0"/>
-          <w:numId w:val="66"/>
+          <w:numId w:val="65"/>
         </w:numPr>
       </w:pPr>
-      <w:proofErr w:type="spellStart"/>
-      <w:r>
-        <w:t>select_random_sample</w:t>
-      </w:r>
-      <w:proofErr w:type="spellEnd"/>
-      <w:r>
-        <w:t>(candidates): Extracts a random control group.</w:t>
-      </w:r>
-    </w:p>
-    <w:p>
-      <w:pPr>
-        <w:pStyle w:val="Titolo3"/>
-        <w:rPr>
-          <w:lang w:val="it-IT"/>
-        </w:rPr>
-      </w:pPr>
-      <w:proofErr w:type="spellStart"/>
-      <w:r>
-        <w:rPr>
-          <w:lang w:val="it-IT"/>
-        </w:rPr>
-        <w:t>Visualizer</w:t>
-      </w:r>
-      <w:proofErr w:type="spellEnd"/>
-      <w:r>
-        <w:rPr>
-          <w:lang w:val="it-IT"/>
-        </w:rPr>
-        <w:t xml:space="preserve"> </w:t>
-      </w:r>
-    </w:p>
-    <w:p>
-      <w:pPr>
-        <w:ind w:left="360"/>
-      </w:pPr>
-      <w:r>
-        <w:t>Manages the generation of diagnostic and results figures.</w:t>
+      <w:r>
+        <w:t>top_percentile_sim : float — percentile for similarity-based selection</w:t>
+      </w:r>
+    </w:p>
+    <w:p>
+      <w:pPr>
+        <w:pStyle w:val="Paragrafoelenco"/>
+        <w:numPr>
+          <w:ilvl w:val="0"/>
+          <w:numId w:val="65"/>
+        </w:numPr>
+      </w:pPr>
+      <w:r>
+        <w:t>top_k : int — number of candidates selected in combined ranking</w:t>
+      </w:r>
+    </w:p>
+    <w:p>
+      <w:pPr>
+        <w:pStyle w:val="Paragrafoelenco"/>
+        <w:numPr>
+          <w:ilvl w:val="0"/>
+          <w:numId w:val="65"/>
+        </w:numPr>
+      </w:pPr>
+      <w:r>
+        <w:t>control_k : int — size of the random control sample</w:t>
       </w:r>
     </w:p>
     <w:p>
@@ -2323,19 +1572,113 @@
           <w:lang w:val="it-IT"/>
         </w:rPr>
       </w:pPr>
-      <w:proofErr w:type="spellStart"/>
       <w:r>
         <w:rPr>
           <w:lang w:val="it-IT"/>
         </w:rPr>
-        <w:t>Responsibilities</w:t>
-      </w:r>
-      <w:proofErr w:type="spellEnd"/>
-      <w:r>
+        <w:t>Methods:</w:t>
+      </w:r>
+    </w:p>
+    <w:p>
+      <w:pPr>
+        <w:pStyle w:val="Paragrafoelenco"/>
+        <w:numPr>
+          <w:ilvl w:val="0"/>
+          <w:numId w:val="65"/>
+        </w:numPr>
+      </w:pPr>
+      <w:r>
+        <w:t>top_percentile_per_group(candidates, score_attr, percentile)</w:t>
+      </w:r>
+      <w:r>
+        <w:t xml:space="preserve"> - s</w:t>
+      </w:r>
+      <w:r>
+        <w:t>elects the top percentile per (target, band) for a given score.</w:t>
+      </w:r>
+    </w:p>
+    <w:p>
+      <w:pPr>
+        <w:pStyle w:val="Paragrafoelenco"/>
+        <w:numPr>
+          <w:ilvl w:val="0"/>
+          <w:numId w:val="65"/>
+        </w:numPr>
+      </w:pPr>
+      <w:r>
+        <w:t>top_k_combined(candidates)</w:t>
+      </w:r>
+      <w:r>
+        <w:t xml:space="preserve"> - r</w:t>
+      </w:r>
+      <w:r>
+        <w:t>eturns the Top-K candidates using equal weighting of frequency and similarity scores.</w:t>
+      </w:r>
+    </w:p>
+    <w:p>
+      <w:pPr>
+        <w:pStyle w:val="Paragrafoelenco"/>
+        <w:numPr>
+          <w:ilvl w:val="0"/>
+          <w:numId w:val="65"/>
+        </w:numPr>
+      </w:pPr>
+      <w:r>
+        <w:t>random_control(candidates)</w:t>
+      </w:r>
+      <w:r>
+        <w:t xml:space="preserve"> - e</w:t>
+      </w:r>
+      <w:r>
+        <w:t>xtracts a reproducible random control sample.</w:t>
+      </w:r>
+    </w:p>
+    <w:p>
+      <w:pPr>
+        <w:pStyle w:val="Paragrafoelenco"/>
+        <w:numPr>
+          <w:ilvl w:val="0"/>
+          <w:numId w:val="65"/>
+        </w:numPr>
+      </w:pPr>
+      <w:r>
+        <w:t>build_samples(candidates)</w:t>
+      </w:r>
+      <w:r>
+        <w:t xml:space="preserve"> - b</w:t>
+      </w:r>
+      <w:r>
+        <w:t>uilds and returns all ranking samples defined by the pipeline.</w:t>
+      </w:r>
+    </w:p>
+    <w:p>
+      <w:pPr>
+        <w:pStyle w:val="Titolo3"/>
+      </w:pPr>
+      <w:r>
+        <w:t xml:space="preserve">Visualizer </w:t>
+      </w:r>
+    </w:p>
+    <w:p>
+      <w:pPr>
+        <w:ind w:left="360"/>
+      </w:pPr>
+      <w:r>
+        <w:t>Manages the generation of diagnostic and results figures.</w:t>
+      </w:r>
+    </w:p>
+    <w:p>
+      <w:pPr>
+        <w:ind w:left="360"/>
         <w:rPr>
           <w:lang w:val="it-IT"/>
         </w:rPr>
-        <w:t>:</w:t>
+      </w:pPr>
+      <w:r>
+        <w:rPr>
+          <w:lang w:val="it-IT"/>
+        </w:rPr>
+        <w:t>Responsibilities:</w:t>
       </w:r>
     </w:p>
     <w:p>
@@ -2369,19 +1712,11 @@
           <w:lang w:val="it-IT"/>
         </w:rPr>
       </w:pPr>
-      <w:proofErr w:type="spellStart"/>
       <w:r>
         <w:rPr>
           <w:lang w:val="it-IT"/>
         </w:rPr>
-        <w:t>Attributes</w:t>
-      </w:r>
-      <w:proofErr w:type="spellEnd"/>
-      <w:r>
-        <w:rPr>
-          <w:lang w:val="it-IT"/>
-        </w:rPr>
-        <w:t>:</w:t>
+        <w:t>Attributes:</w:t>
       </w:r>
     </w:p>
     <w:p>
@@ -2392,13 +1727,8 @@
           <w:numId w:val="67"/>
         </w:numPr>
       </w:pPr>
-      <w:proofErr w:type="spellStart"/>
-      <w:r>
-        <w:t>output_dir</w:t>
-      </w:r>
-      <w:proofErr w:type="spellEnd"/>
-      <w:r>
-        <w:t>: Path for saving figures.</w:t>
+      <w:r>
+        <w:t>output_dir: Path for saving figures.</w:t>
       </w:r>
     </w:p>
     <w:p>
@@ -2417,53 +1747,8 @@
           <w:numId w:val="67"/>
         </w:numPr>
       </w:pPr>
-      <w:proofErr w:type="spellStart"/>
-      <w:r>
-        <w:t>plot_umap_</w:t>
-      </w:r>
-      <w:proofErr w:type="gramStart"/>
-      <w:r>
-        <w:t>embedding</w:t>
-      </w:r>
-      <w:proofErr w:type="spellEnd"/>
-      <w:r>
-        <w:t>(</w:t>
-      </w:r>
-      <w:proofErr w:type="gramEnd"/>
-      <w:r>
-        <w:t xml:space="preserve">Z, labels, title, filename, </w:t>
-      </w:r>
-      <w:proofErr w:type="spellStart"/>
-      <w:r>
-        <w:t>on_cat</w:t>
-      </w:r>
-      <w:proofErr w:type="spellEnd"/>
-      <w:r>
-        <w:t xml:space="preserve">, </w:t>
-      </w:r>
-      <w:proofErr w:type="spellStart"/>
-      <w:r>
-        <w:t>off_cat</w:t>
-      </w:r>
-      <w:proofErr w:type="spellEnd"/>
-      <w:r>
-        <w:t xml:space="preserve">, </w:t>
-      </w:r>
-      <w:proofErr w:type="spellStart"/>
-      <w:r>
-        <w:t>kde_on</w:t>
-      </w:r>
-      <w:proofErr w:type="spellEnd"/>
-      <w:r>
-        <w:t xml:space="preserve">, </w:t>
-      </w:r>
-      <w:proofErr w:type="spellStart"/>
-      <w:r>
-        <w:t>kde_off</w:t>
-      </w:r>
-      <w:proofErr w:type="spellEnd"/>
-      <w:r>
-        <w:t xml:space="preserve">): Generates a 2D UMAP scatter plot featuring marginal histograms for X and Y coordinates. It optionally </w:t>
+      <w:r>
+        <w:t xml:space="preserve">plot_umap_embedding(Z, labels, title, filename, on_cat, off_cat, kde_on, kde_off): Generates a 2D UMAP scatter plot featuring marginal histograms for X and Y coordinates. It optionally </w:t>
       </w:r>
       <w:r>
         <w:t>overlays KDE contour lines</w:t>
@@ -2480,44 +1765,18 @@
           <w:numId w:val="67"/>
         </w:numPr>
       </w:pPr>
-      <w:proofErr w:type="spellStart"/>
-      <w:r>
-        <w:t>plot_density_</w:t>
-      </w:r>
-      <w:proofErr w:type="gramStart"/>
-      <w:r>
-        <w:t>histogram</w:t>
-      </w:r>
-      <w:proofErr w:type="spellEnd"/>
-      <w:r>
-        <w:t>(</w:t>
-      </w:r>
-      <w:proofErr w:type="gramEnd"/>
-      <w:r>
-        <w:t>densities, threshold, filename): Creates a histogram of the density probabilities on a log scale, including a vertical line representing the rejection threshold.</w:t>
+      <w:r>
+        <w:t>plot_density_histogram(densities, threshold, filename): Creates a histogram of the density probabilities on a log scale, including a vertical line representing the rejection threshold.</w:t>
       </w:r>
     </w:p>
     <w:p>
       <w:pPr>
         <w:pStyle w:val="Titolo2"/>
-        <w:rPr>
-          <w:lang w:val="it-IT"/>
-        </w:rPr>
-      </w:pPr>
-      <w:r>
-        <w:rPr>
-          <w:lang w:val="it-IT"/>
-        </w:rPr>
-        <w:t xml:space="preserve">Main </w:t>
-      </w:r>
-      <w:proofErr w:type="spellStart"/>
-      <w:r>
-        <w:rPr>
-          <w:lang w:val="it-IT"/>
-        </w:rPr>
-        <w:t>Relationships</w:t>
-      </w:r>
-      <w:proofErr w:type="spellEnd"/>
+      </w:pPr>
+      <w:r>
+        <w:lastRenderedPageBreak/>
+        <w:t>Main Relationships</w:t>
+      </w:r>
     </w:p>
     <w:p>
       <w:pPr>
@@ -2527,39 +1786,7 @@
         <w:t>Inheritance</w:t>
       </w:r>
       <w:r>
-        <w:t xml:space="preserve">: </w:t>
-      </w:r>
-      <w:proofErr w:type="spellStart"/>
-      <w:r>
-        <w:t>IFilter</w:t>
-      </w:r>
-      <w:proofErr w:type="spellEnd"/>
-      <w:r>
-        <w:t xml:space="preserve"> is implemented by </w:t>
-      </w:r>
-      <w:proofErr w:type="spellStart"/>
-      <w:r>
-        <w:t>DensityFilter</w:t>
-      </w:r>
-      <w:proofErr w:type="spellEnd"/>
-      <w:r>
-        <w:t xml:space="preserve">, </w:t>
-      </w:r>
-      <w:proofErr w:type="spellStart"/>
-      <w:r>
-        <w:t>FrequencyFilter</w:t>
-      </w:r>
-      <w:proofErr w:type="spellEnd"/>
-      <w:r>
-        <w:t xml:space="preserve">, and </w:t>
-      </w:r>
-      <w:proofErr w:type="spellStart"/>
-      <w:r>
-        <w:t>SimilarityFilter</w:t>
-      </w:r>
-      <w:proofErr w:type="spellEnd"/>
-      <w:r>
-        <w:t>.</w:t>
+        <w:t>: IFilter is implemented by DensityFilter, FrequencyFilter, and SimilarityFilter.</w:t>
       </w:r>
     </w:p>
     <w:p>
@@ -5724,6 +4951,119 @@
     </w:lvl>
   </w:abstractNum>
   <w:abstractNum w:abstractNumId="27" w15:restartNumberingAfterBreak="0">
+    <w:nsid w:val="29C65ABA"/>
+    <w:multiLevelType w:val="hybridMultilevel"/>
+    <w:tmpl w:val="C0D64E88"/>
+    <w:lvl w:ilvl="0" w:tplc="04100001">
+      <w:start w:val="1"/>
+      <w:numFmt w:val="bullet"/>
+      <w:lvlText w:val=""/>
+      <w:lvlJc w:val="left"/>
+      <w:pPr>
+        <w:ind w:left="1080" w:hanging="360"/>
+      </w:pPr>
+      <w:rPr>
+        <w:rFonts w:ascii="Symbol" w:hAnsi="Symbol" w:hint="default"/>
+      </w:rPr>
+    </w:lvl>
+    <w:lvl w:ilvl="1" w:tplc="04100003" w:tentative="1">
+      <w:start w:val="1"/>
+      <w:numFmt w:val="bullet"/>
+      <w:lvlText w:val="o"/>
+      <w:lvlJc w:val="left"/>
+      <w:pPr>
+        <w:ind w:left="1800" w:hanging="360"/>
+      </w:pPr>
+      <w:rPr>
+        <w:rFonts w:ascii="Courier New" w:hAnsi="Courier New" w:cs="Courier New" w:hint="default"/>
+      </w:rPr>
+    </w:lvl>
+    <w:lvl w:ilvl="2" w:tplc="04100005" w:tentative="1">
+      <w:start w:val="1"/>
+      <w:numFmt w:val="bullet"/>
+      <w:lvlText w:val=""/>
+      <w:lvlJc w:val="left"/>
+      <w:pPr>
+        <w:ind w:left="2520" w:hanging="360"/>
+      </w:pPr>
+      <w:rPr>
+        <w:rFonts w:ascii="Wingdings" w:hAnsi="Wingdings" w:hint="default"/>
+      </w:rPr>
+    </w:lvl>
+    <w:lvl w:ilvl="3" w:tplc="04100001" w:tentative="1">
+      <w:start w:val="1"/>
+      <w:numFmt w:val="bullet"/>
+      <w:lvlText w:val=""/>
+      <w:lvlJc w:val="left"/>
+      <w:pPr>
+        <w:ind w:left="3240" w:hanging="360"/>
+      </w:pPr>
+      <w:rPr>
+        <w:rFonts w:ascii="Symbol" w:hAnsi="Symbol" w:hint="default"/>
+      </w:rPr>
+    </w:lvl>
+    <w:lvl w:ilvl="4" w:tplc="04100003" w:tentative="1">
+      <w:start w:val="1"/>
+      <w:numFmt w:val="bullet"/>
+      <w:lvlText w:val="o"/>
+      <w:lvlJc w:val="left"/>
+      <w:pPr>
+        <w:ind w:left="3960" w:hanging="360"/>
+      </w:pPr>
+      <w:rPr>
+        <w:rFonts w:ascii="Courier New" w:hAnsi="Courier New" w:cs="Courier New" w:hint="default"/>
+      </w:rPr>
+    </w:lvl>
+    <w:lvl w:ilvl="5" w:tplc="04100005" w:tentative="1">
+      <w:start w:val="1"/>
+      <w:numFmt w:val="bullet"/>
+      <w:lvlText w:val=""/>
+      <w:lvlJc w:val="left"/>
+      <w:pPr>
+        <w:ind w:left="4680" w:hanging="360"/>
+      </w:pPr>
+      <w:rPr>
+        <w:rFonts w:ascii="Wingdings" w:hAnsi="Wingdings" w:hint="default"/>
+      </w:rPr>
+    </w:lvl>
+    <w:lvl w:ilvl="6" w:tplc="04100001" w:tentative="1">
+      <w:start w:val="1"/>
+      <w:numFmt w:val="bullet"/>
+      <w:lvlText w:val=""/>
+      <w:lvlJc w:val="left"/>
+      <w:pPr>
+        <w:ind w:left="5400" w:hanging="360"/>
+      </w:pPr>
+      <w:rPr>
+        <w:rFonts w:ascii="Symbol" w:hAnsi="Symbol" w:hint="default"/>
+      </w:rPr>
+    </w:lvl>
+    <w:lvl w:ilvl="7" w:tplc="04100003" w:tentative="1">
+      <w:start w:val="1"/>
+      <w:numFmt w:val="bullet"/>
+      <w:lvlText w:val="o"/>
+      <w:lvlJc w:val="left"/>
+      <w:pPr>
+        <w:ind w:left="6120" w:hanging="360"/>
+      </w:pPr>
+      <w:rPr>
+        <w:rFonts w:ascii="Courier New" w:hAnsi="Courier New" w:cs="Courier New" w:hint="default"/>
+      </w:rPr>
+    </w:lvl>
+    <w:lvl w:ilvl="8" w:tplc="04100005" w:tentative="1">
+      <w:start w:val="1"/>
+      <w:numFmt w:val="bullet"/>
+      <w:lvlText w:val=""/>
+      <w:lvlJc w:val="left"/>
+      <w:pPr>
+        <w:ind w:left="6840" w:hanging="360"/>
+      </w:pPr>
+      <w:rPr>
+        <w:rFonts w:ascii="Wingdings" w:hAnsi="Wingdings" w:hint="default"/>
+      </w:rPr>
+    </w:lvl>
+  </w:abstractNum>
+  <w:abstractNum w:abstractNumId="28" w15:restartNumberingAfterBreak="0">
     <w:nsid w:val="2AD44E9C"/>
     <w:multiLevelType w:val="hybridMultilevel"/>
     <w:tmpl w:val="0E5C2394"/>
@@ -5836,7 +5176,7 @@
       </w:rPr>
     </w:lvl>
   </w:abstractNum>
-  <w:abstractNum w:abstractNumId="28" w15:restartNumberingAfterBreak="0">
+  <w:abstractNum w:abstractNumId="29" w15:restartNumberingAfterBreak="0">
     <w:nsid w:val="2BB451A6"/>
     <w:multiLevelType w:val="hybridMultilevel"/>
     <w:tmpl w:val="35684490"/>
@@ -5949,7 +5289,7 @@
       </w:rPr>
     </w:lvl>
   </w:abstractNum>
-  <w:abstractNum w:abstractNumId="29" w15:restartNumberingAfterBreak="0">
+  <w:abstractNum w:abstractNumId="30" w15:restartNumberingAfterBreak="0">
     <w:nsid w:val="2FAC100F"/>
     <w:multiLevelType w:val="hybridMultilevel"/>
     <w:tmpl w:val="73E235BC"/>
@@ -6062,7 +5402,120 @@
       </w:rPr>
     </w:lvl>
   </w:abstractNum>
-  <w:abstractNum w:abstractNumId="30" w15:restartNumberingAfterBreak="0">
+  <w:abstractNum w:abstractNumId="31" w15:restartNumberingAfterBreak="0">
+    <w:nsid w:val="345140E7"/>
+    <w:multiLevelType w:val="hybridMultilevel"/>
+    <w:tmpl w:val="280C9D1C"/>
+    <w:lvl w:ilvl="0" w:tplc="04100001">
+      <w:start w:val="1"/>
+      <w:numFmt w:val="bullet"/>
+      <w:lvlText w:val=""/>
+      <w:lvlJc w:val="left"/>
+      <w:pPr>
+        <w:ind w:left="1080" w:hanging="360"/>
+      </w:pPr>
+      <w:rPr>
+        <w:rFonts w:ascii="Symbol" w:hAnsi="Symbol" w:hint="default"/>
+      </w:rPr>
+    </w:lvl>
+    <w:lvl w:ilvl="1" w:tplc="04100003" w:tentative="1">
+      <w:start w:val="1"/>
+      <w:numFmt w:val="bullet"/>
+      <w:lvlText w:val="o"/>
+      <w:lvlJc w:val="left"/>
+      <w:pPr>
+        <w:ind w:left="1800" w:hanging="360"/>
+      </w:pPr>
+      <w:rPr>
+        <w:rFonts w:ascii="Courier New" w:hAnsi="Courier New" w:cs="Courier New" w:hint="default"/>
+      </w:rPr>
+    </w:lvl>
+    <w:lvl w:ilvl="2" w:tplc="04100005" w:tentative="1">
+      <w:start w:val="1"/>
+      <w:numFmt w:val="bullet"/>
+      <w:lvlText w:val=""/>
+      <w:lvlJc w:val="left"/>
+      <w:pPr>
+        <w:ind w:left="2520" w:hanging="360"/>
+      </w:pPr>
+      <w:rPr>
+        <w:rFonts w:ascii="Wingdings" w:hAnsi="Wingdings" w:hint="default"/>
+      </w:rPr>
+    </w:lvl>
+    <w:lvl w:ilvl="3" w:tplc="04100001" w:tentative="1">
+      <w:start w:val="1"/>
+      <w:numFmt w:val="bullet"/>
+      <w:lvlText w:val=""/>
+      <w:lvlJc w:val="left"/>
+      <w:pPr>
+        <w:ind w:left="3240" w:hanging="360"/>
+      </w:pPr>
+      <w:rPr>
+        <w:rFonts w:ascii="Symbol" w:hAnsi="Symbol" w:hint="default"/>
+      </w:rPr>
+    </w:lvl>
+    <w:lvl w:ilvl="4" w:tplc="04100003" w:tentative="1">
+      <w:start w:val="1"/>
+      <w:numFmt w:val="bullet"/>
+      <w:lvlText w:val="o"/>
+      <w:lvlJc w:val="left"/>
+      <w:pPr>
+        <w:ind w:left="3960" w:hanging="360"/>
+      </w:pPr>
+      <w:rPr>
+        <w:rFonts w:ascii="Courier New" w:hAnsi="Courier New" w:cs="Courier New" w:hint="default"/>
+      </w:rPr>
+    </w:lvl>
+    <w:lvl w:ilvl="5" w:tplc="04100005" w:tentative="1">
+      <w:start w:val="1"/>
+      <w:numFmt w:val="bullet"/>
+      <w:lvlText w:val=""/>
+      <w:lvlJc w:val="left"/>
+      <w:pPr>
+        <w:ind w:left="4680" w:hanging="360"/>
+      </w:pPr>
+      <w:rPr>
+        <w:rFonts w:ascii="Wingdings" w:hAnsi="Wingdings" w:hint="default"/>
+      </w:rPr>
+    </w:lvl>
+    <w:lvl w:ilvl="6" w:tplc="04100001" w:tentative="1">
+      <w:start w:val="1"/>
+      <w:numFmt w:val="bullet"/>
+      <w:lvlText w:val=""/>
+      <w:lvlJc w:val="left"/>
+      <w:pPr>
+        <w:ind w:left="5400" w:hanging="360"/>
+      </w:pPr>
+      <w:rPr>
+        <w:rFonts w:ascii="Symbol" w:hAnsi="Symbol" w:hint="default"/>
+      </w:rPr>
+    </w:lvl>
+    <w:lvl w:ilvl="7" w:tplc="04100003" w:tentative="1">
+      <w:start w:val="1"/>
+      <w:numFmt w:val="bullet"/>
+      <w:lvlText w:val="o"/>
+      <w:lvlJc w:val="left"/>
+      <w:pPr>
+        <w:ind w:left="6120" w:hanging="360"/>
+      </w:pPr>
+      <w:rPr>
+        <w:rFonts w:ascii="Courier New" w:hAnsi="Courier New" w:cs="Courier New" w:hint="default"/>
+      </w:rPr>
+    </w:lvl>
+    <w:lvl w:ilvl="8" w:tplc="04100005" w:tentative="1">
+      <w:start w:val="1"/>
+      <w:numFmt w:val="bullet"/>
+      <w:lvlText w:val=""/>
+      <w:lvlJc w:val="left"/>
+      <w:pPr>
+        <w:ind w:left="6840" w:hanging="360"/>
+      </w:pPr>
+      <w:rPr>
+        <w:rFonts w:ascii="Wingdings" w:hAnsi="Wingdings" w:hint="default"/>
+      </w:rPr>
+    </w:lvl>
+  </w:abstractNum>
+  <w:abstractNum w:abstractNumId="32" w15:restartNumberingAfterBreak="0">
     <w:nsid w:val="3654650C"/>
     <w:multiLevelType w:val="hybridMultilevel"/>
     <w:tmpl w:val="ADBA3600"/>
@@ -6175,7 +5628,7 @@
       </w:rPr>
     </w:lvl>
   </w:abstractNum>
-  <w:abstractNum w:abstractNumId="31" w15:restartNumberingAfterBreak="0">
+  <w:abstractNum w:abstractNumId="33" w15:restartNumberingAfterBreak="0">
     <w:nsid w:val="36552859"/>
     <w:multiLevelType w:val="hybridMultilevel"/>
     <w:tmpl w:val="19FE8FD6"/>
@@ -6288,7 +5741,7 @@
       </w:rPr>
     </w:lvl>
   </w:abstractNum>
-  <w:abstractNum w:abstractNumId="32" w15:restartNumberingAfterBreak="0">
+  <w:abstractNum w:abstractNumId="34" w15:restartNumberingAfterBreak="0">
     <w:nsid w:val="367260BC"/>
     <w:multiLevelType w:val="hybridMultilevel"/>
     <w:tmpl w:val="BA12E19C"/>
@@ -6401,7 +5854,7 @@
       </w:rPr>
     </w:lvl>
   </w:abstractNum>
-  <w:abstractNum w:abstractNumId="33" w15:restartNumberingAfterBreak="0">
+  <w:abstractNum w:abstractNumId="35" w15:restartNumberingAfterBreak="0">
     <w:nsid w:val="3D6F0890"/>
     <w:multiLevelType w:val="hybridMultilevel"/>
     <w:tmpl w:val="5972C62A"/>
@@ -6514,7 +5967,7 @@
       </w:rPr>
     </w:lvl>
   </w:abstractNum>
-  <w:abstractNum w:abstractNumId="34" w15:restartNumberingAfterBreak="0">
+  <w:abstractNum w:abstractNumId="36" w15:restartNumberingAfterBreak="0">
     <w:nsid w:val="3D8272F3"/>
     <w:multiLevelType w:val="hybridMultilevel"/>
     <w:tmpl w:val="3C20EDE0"/>
@@ -6627,7 +6080,7 @@
       </w:rPr>
     </w:lvl>
   </w:abstractNum>
-  <w:abstractNum w:abstractNumId="35" w15:restartNumberingAfterBreak="0">
+  <w:abstractNum w:abstractNumId="37" w15:restartNumberingAfterBreak="0">
     <w:nsid w:val="3E895300"/>
     <w:multiLevelType w:val="hybridMultilevel"/>
     <w:tmpl w:val="E66EC4A8"/>
@@ -6740,7 +6193,7 @@
       </w:rPr>
     </w:lvl>
   </w:abstractNum>
-  <w:abstractNum w:abstractNumId="36" w15:restartNumberingAfterBreak="0">
+  <w:abstractNum w:abstractNumId="38" w15:restartNumberingAfterBreak="0">
     <w:nsid w:val="437A5D1C"/>
     <w:multiLevelType w:val="multilevel"/>
     <w:tmpl w:val="90C65E7E"/>
@@ -6889,7 +6342,7 @@
       </w:rPr>
     </w:lvl>
   </w:abstractNum>
-  <w:abstractNum w:abstractNumId="37" w15:restartNumberingAfterBreak="0">
+  <w:abstractNum w:abstractNumId="39" w15:restartNumberingAfterBreak="0">
     <w:nsid w:val="43E441EC"/>
     <w:multiLevelType w:val="multilevel"/>
     <w:tmpl w:val="5E3212AE"/>
@@ -7038,7 +6491,7 @@
       </w:rPr>
     </w:lvl>
   </w:abstractNum>
-  <w:abstractNum w:abstractNumId="38" w15:restartNumberingAfterBreak="0">
+  <w:abstractNum w:abstractNumId="40" w15:restartNumberingAfterBreak="0">
     <w:nsid w:val="44CC0217"/>
     <w:multiLevelType w:val="hybridMultilevel"/>
     <w:tmpl w:val="B036AE90"/>
@@ -7151,7 +6604,7 @@
       </w:rPr>
     </w:lvl>
   </w:abstractNum>
-  <w:abstractNum w:abstractNumId="39" w15:restartNumberingAfterBreak="0">
+  <w:abstractNum w:abstractNumId="41" w15:restartNumberingAfterBreak="0">
     <w:nsid w:val="46723CA9"/>
     <w:multiLevelType w:val="multilevel"/>
     <w:tmpl w:val="DA965626"/>
@@ -7300,7 +6753,7 @@
       </w:rPr>
     </w:lvl>
   </w:abstractNum>
-  <w:abstractNum w:abstractNumId="40" w15:restartNumberingAfterBreak="0">
+  <w:abstractNum w:abstractNumId="42" w15:restartNumberingAfterBreak="0">
     <w:nsid w:val="47135F64"/>
     <w:multiLevelType w:val="hybridMultilevel"/>
     <w:tmpl w:val="70AC0A8E"/>
@@ -7413,7 +6866,7 @@
       </w:rPr>
     </w:lvl>
   </w:abstractNum>
-  <w:abstractNum w:abstractNumId="41" w15:restartNumberingAfterBreak="0">
+  <w:abstractNum w:abstractNumId="43" w15:restartNumberingAfterBreak="0">
     <w:nsid w:val="47600046"/>
     <w:multiLevelType w:val="multilevel"/>
     <w:tmpl w:val="47E46CB4"/>
@@ -7562,7 +7015,7 @@
       </w:rPr>
     </w:lvl>
   </w:abstractNum>
-  <w:abstractNum w:abstractNumId="42" w15:restartNumberingAfterBreak="0">
+  <w:abstractNum w:abstractNumId="44" w15:restartNumberingAfterBreak="0">
     <w:nsid w:val="47863434"/>
     <w:multiLevelType w:val="hybridMultilevel"/>
     <w:tmpl w:val="FD52FC52"/>
@@ -7675,7 +7128,7 @@
       </w:rPr>
     </w:lvl>
   </w:abstractNum>
-  <w:abstractNum w:abstractNumId="43" w15:restartNumberingAfterBreak="0">
+  <w:abstractNum w:abstractNumId="45" w15:restartNumberingAfterBreak="0">
     <w:nsid w:val="48DE2AE3"/>
     <w:multiLevelType w:val="hybridMultilevel"/>
     <w:tmpl w:val="E7D20DF4"/>
@@ -7788,7 +7241,7 @@
       </w:rPr>
     </w:lvl>
   </w:abstractNum>
-  <w:abstractNum w:abstractNumId="44" w15:restartNumberingAfterBreak="0">
+  <w:abstractNum w:abstractNumId="46" w15:restartNumberingAfterBreak="0">
     <w:nsid w:val="4ABF3D7D"/>
     <w:multiLevelType w:val="hybridMultilevel"/>
     <w:tmpl w:val="4050B5F0"/>
@@ -7901,7 +7354,7 @@
       </w:rPr>
     </w:lvl>
   </w:abstractNum>
-  <w:abstractNum w:abstractNumId="45" w15:restartNumberingAfterBreak="0">
+  <w:abstractNum w:abstractNumId="47" w15:restartNumberingAfterBreak="0">
     <w:nsid w:val="4C7328EE"/>
     <w:multiLevelType w:val="hybridMultilevel"/>
     <w:tmpl w:val="D5FCA776"/>
@@ -8014,7 +7467,7 @@
       </w:rPr>
     </w:lvl>
   </w:abstractNum>
-  <w:abstractNum w:abstractNumId="46" w15:restartNumberingAfterBreak="0">
+  <w:abstractNum w:abstractNumId="48" w15:restartNumberingAfterBreak="0">
     <w:nsid w:val="4FC4564C"/>
     <w:multiLevelType w:val="hybridMultilevel"/>
     <w:tmpl w:val="BED21916"/>
@@ -8127,7 +7580,120 @@
       </w:rPr>
     </w:lvl>
   </w:abstractNum>
-  <w:abstractNum w:abstractNumId="47" w15:restartNumberingAfterBreak="0">
+  <w:abstractNum w:abstractNumId="49" w15:restartNumberingAfterBreak="0">
+    <w:nsid w:val="52C33B91"/>
+    <w:multiLevelType w:val="hybridMultilevel"/>
+    <w:tmpl w:val="F0684B50"/>
+    <w:lvl w:ilvl="0" w:tplc="04100001">
+      <w:start w:val="1"/>
+      <w:numFmt w:val="bullet"/>
+      <w:lvlText w:val=""/>
+      <w:lvlJc w:val="left"/>
+      <w:pPr>
+        <w:ind w:left="1080" w:hanging="360"/>
+      </w:pPr>
+      <w:rPr>
+        <w:rFonts w:ascii="Symbol" w:hAnsi="Symbol" w:hint="default"/>
+      </w:rPr>
+    </w:lvl>
+    <w:lvl w:ilvl="1" w:tplc="04100003" w:tentative="1">
+      <w:start w:val="1"/>
+      <w:numFmt w:val="bullet"/>
+      <w:lvlText w:val="o"/>
+      <w:lvlJc w:val="left"/>
+      <w:pPr>
+        <w:ind w:left="1800" w:hanging="360"/>
+      </w:pPr>
+      <w:rPr>
+        <w:rFonts w:ascii="Courier New" w:hAnsi="Courier New" w:cs="Courier New" w:hint="default"/>
+      </w:rPr>
+    </w:lvl>
+    <w:lvl w:ilvl="2" w:tplc="04100005" w:tentative="1">
+      <w:start w:val="1"/>
+      <w:numFmt w:val="bullet"/>
+      <w:lvlText w:val=""/>
+      <w:lvlJc w:val="left"/>
+      <w:pPr>
+        <w:ind w:left="2520" w:hanging="360"/>
+      </w:pPr>
+      <w:rPr>
+        <w:rFonts w:ascii="Wingdings" w:hAnsi="Wingdings" w:hint="default"/>
+      </w:rPr>
+    </w:lvl>
+    <w:lvl w:ilvl="3" w:tplc="04100001" w:tentative="1">
+      <w:start w:val="1"/>
+      <w:numFmt w:val="bullet"/>
+      <w:lvlText w:val=""/>
+      <w:lvlJc w:val="left"/>
+      <w:pPr>
+        <w:ind w:left="3240" w:hanging="360"/>
+      </w:pPr>
+      <w:rPr>
+        <w:rFonts w:ascii="Symbol" w:hAnsi="Symbol" w:hint="default"/>
+      </w:rPr>
+    </w:lvl>
+    <w:lvl w:ilvl="4" w:tplc="04100003" w:tentative="1">
+      <w:start w:val="1"/>
+      <w:numFmt w:val="bullet"/>
+      <w:lvlText w:val="o"/>
+      <w:lvlJc w:val="left"/>
+      <w:pPr>
+        <w:ind w:left="3960" w:hanging="360"/>
+      </w:pPr>
+      <w:rPr>
+        <w:rFonts w:ascii="Courier New" w:hAnsi="Courier New" w:cs="Courier New" w:hint="default"/>
+      </w:rPr>
+    </w:lvl>
+    <w:lvl w:ilvl="5" w:tplc="04100005" w:tentative="1">
+      <w:start w:val="1"/>
+      <w:numFmt w:val="bullet"/>
+      <w:lvlText w:val=""/>
+      <w:lvlJc w:val="left"/>
+      <w:pPr>
+        <w:ind w:left="4680" w:hanging="360"/>
+      </w:pPr>
+      <w:rPr>
+        <w:rFonts w:ascii="Wingdings" w:hAnsi="Wingdings" w:hint="default"/>
+      </w:rPr>
+    </w:lvl>
+    <w:lvl w:ilvl="6" w:tplc="04100001" w:tentative="1">
+      <w:start w:val="1"/>
+      <w:numFmt w:val="bullet"/>
+      <w:lvlText w:val=""/>
+      <w:lvlJc w:val="left"/>
+      <w:pPr>
+        <w:ind w:left="5400" w:hanging="360"/>
+      </w:pPr>
+      <w:rPr>
+        <w:rFonts w:ascii="Symbol" w:hAnsi="Symbol" w:hint="default"/>
+      </w:rPr>
+    </w:lvl>
+    <w:lvl w:ilvl="7" w:tplc="04100003" w:tentative="1">
+      <w:start w:val="1"/>
+      <w:numFmt w:val="bullet"/>
+      <w:lvlText w:val="o"/>
+      <w:lvlJc w:val="left"/>
+      <w:pPr>
+        <w:ind w:left="6120" w:hanging="360"/>
+      </w:pPr>
+      <w:rPr>
+        <w:rFonts w:ascii="Courier New" w:hAnsi="Courier New" w:cs="Courier New" w:hint="default"/>
+      </w:rPr>
+    </w:lvl>
+    <w:lvl w:ilvl="8" w:tplc="04100005" w:tentative="1">
+      <w:start w:val="1"/>
+      <w:numFmt w:val="bullet"/>
+      <w:lvlText w:val=""/>
+      <w:lvlJc w:val="left"/>
+      <w:pPr>
+        <w:ind w:left="6840" w:hanging="360"/>
+      </w:pPr>
+      <w:rPr>
+        <w:rFonts w:ascii="Wingdings" w:hAnsi="Wingdings" w:hint="default"/>
+      </w:rPr>
+    </w:lvl>
+  </w:abstractNum>
+  <w:abstractNum w:abstractNumId="50" w15:restartNumberingAfterBreak="0">
     <w:nsid w:val="54D82744"/>
     <w:multiLevelType w:val="hybridMultilevel"/>
     <w:tmpl w:val="456A7072"/>
@@ -8240,7 +7806,7 @@
       </w:rPr>
     </w:lvl>
   </w:abstractNum>
-  <w:abstractNum w:abstractNumId="48" w15:restartNumberingAfterBreak="0">
+  <w:abstractNum w:abstractNumId="51" w15:restartNumberingAfterBreak="0">
     <w:nsid w:val="55A97FAB"/>
     <w:multiLevelType w:val="hybridMultilevel"/>
     <w:tmpl w:val="44C0E9EE"/>
@@ -8353,7 +7919,7 @@
       </w:rPr>
     </w:lvl>
   </w:abstractNum>
-  <w:abstractNum w:abstractNumId="49" w15:restartNumberingAfterBreak="0">
+  <w:abstractNum w:abstractNumId="52" w15:restartNumberingAfterBreak="0">
     <w:nsid w:val="55C366CF"/>
     <w:multiLevelType w:val="hybridMultilevel"/>
     <w:tmpl w:val="BAACE4E6"/>
@@ -8466,7 +8032,7 @@
       </w:rPr>
     </w:lvl>
   </w:abstractNum>
-  <w:abstractNum w:abstractNumId="50" w15:restartNumberingAfterBreak="0">
+  <w:abstractNum w:abstractNumId="53" w15:restartNumberingAfterBreak="0">
     <w:nsid w:val="55D51B0C"/>
     <w:multiLevelType w:val="multilevel"/>
     <w:tmpl w:val="B1AEED82"/>
@@ -8615,7 +8181,7 @@
       </w:rPr>
     </w:lvl>
   </w:abstractNum>
-  <w:abstractNum w:abstractNumId="51" w15:restartNumberingAfterBreak="0">
+  <w:abstractNum w:abstractNumId="54" w15:restartNumberingAfterBreak="0">
     <w:nsid w:val="55DC2408"/>
     <w:multiLevelType w:val="multilevel"/>
     <w:tmpl w:val="F6607808"/>
@@ -8764,7 +8330,7 @@
       </w:rPr>
     </w:lvl>
   </w:abstractNum>
-  <w:abstractNum w:abstractNumId="52" w15:restartNumberingAfterBreak="0">
+  <w:abstractNum w:abstractNumId="55" w15:restartNumberingAfterBreak="0">
     <w:nsid w:val="5982140E"/>
     <w:multiLevelType w:val="multilevel"/>
     <w:tmpl w:val="1BA02D10"/>
@@ -8913,7 +8479,7 @@
       </w:rPr>
     </w:lvl>
   </w:abstractNum>
-  <w:abstractNum w:abstractNumId="53" w15:restartNumberingAfterBreak="0">
+  <w:abstractNum w:abstractNumId="56" w15:restartNumberingAfterBreak="0">
     <w:nsid w:val="5AE2576F"/>
     <w:multiLevelType w:val="hybridMultilevel"/>
     <w:tmpl w:val="2E922554"/>
@@ -9026,7 +8592,7 @@
       </w:rPr>
     </w:lvl>
   </w:abstractNum>
-  <w:abstractNum w:abstractNumId="54" w15:restartNumberingAfterBreak="0">
+  <w:abstractNum w:abstractNumId="57" w15:restartNumberingAfterBreak="0">
     <w:nsid w:val="5B807AA3"/>
     <w:multiLevelType w:val="hybridMultilevel"/>
     <w:tmpl w:val="FE2214B8"/>
@@ -9139,7 +8705,7 @@
       </w:rPr>
     </w:lvl>
   </w:abstractNum>
-  <w:abstractNum w:abstractNumId="55" w15:restartNumberingAfterBreak="0">
+  <w:abstractNum w:abstractNumId="58" w15:restartNumberingAfterBreak="0">
     <w:nsid w:val="5C462125"/>
     <w:multiLevelType w:val="hybridMultilevel"/>
     <w:tmpl w:val="76E24CDA"/>
@@ -9252,7 +8818,7 @@
       </w:rPr>
     </w:lvl>
   </w:abstractNum>
-  <w:abstractNum w:abstractNumId="56" w15:restartNumberingAfterBreak="0">
+  <w:abstractNum w:abstractNumId="59" w15:restartNumberingAfterBreak="0">
     <w:nsid w:val="5D927884"/>
     <w:multiLevelType w:val="hybridMultilevel"/>
     <w:tmpl w:val="5CE098C4"/>
@@ -9365,7 +8931,7 @@
       </w:rPr>
     </w:lvl>
   </w:abstractNum>
-  <w:abstractNum w:abstractNumId="57" w15:restartNumberingAfterBreak="0">
+  <w:abstractNum w:abstractNumId="60" w15:restartNumberingAfterBreak="0">
     <w:nsid w:val="60A27AC4"/>
     <w:multiLevelType w:val="hybridMultilevel"/>
     <w:tmpl w:val="2340C1F2"/>
@@ -9478,7 +9044,7 @@
       </w:rPr>
     </w:lvl>
   </w:abstractNum>
-  <w:abstractNum w:abstractNumId="58" w15:restartNumberingAfterBreak="0">
+  <w:abstractNum w:abstractNumId="61" w15:restartNumberingAfterBreak="0">
     <w:nsid w:val="640435DA"/>
     <w:multiLevelType w:val="hybridMultilevel"/>
     <w:tmpl w:val="620E1B50"/>
@@ -9591,7 +9157,7 @@
       </w:rPr>
     </w:lvl>
   </w:abstractNum>
-  <w:abstractNum w:abstractNumId="59" w15:restartNumberingAfterBreak="0">
+  <w:abstractNum w:abstractNumId="62" w15:restartNumberingAfterBreak="0">
     <w:nsid w:val="67CB1DA8"/>
     <w:multiLevelType w:val="hybridMultilevel"/>
     <w:tmpl w:val="274CDEA2"/>
@@ -9704,7 +9270,7 @@
       </w:rPr>
     </w:lvl>
   </w:abstractNum>
-  <w:abstractNum w:abstractNumId="60" w15:restartNumberingAfterBreak="0">
+  <w:abstractNum w:abstractNumId="63" w15:restartNumberingAfterBreak="0">
     <w:nsid w:val="689E38CB"/>
     <w:multiLevelType w:val="hybridMultilevel"/>
     <w:tmpl w:val="F3FA7EC2"/>
@@ -9817,7 +9383,7 @@
       </w:rPr>
     </w:lvl>
   </w:abstractNum>
-  <w:abstractNum w:abstractNumId="61" w15:restartNumberingAfterBreak="0">
+  <w:abstractNum w:abstractNumId="64" w15:restartNumberingAfterBreak="0">
     <w:nsid w:val="6A934BA2"/>
     <w:multiLevelType w:val="hybridMultilevel"/>
     <w:tmpl w:val="B3DC86A6"/>
@@ -9930,7 +9496,7 @@
       </w:rPr>
     </w:lvl>
   </w:abstractNum>
-  <w:abstractNum w:abstractNumId="62" w15:restartNumberingAfterBreak="0">
+  <w:abstractNum w:abstractNumId="65" w15:restartNumberingAfterBreak="0">
     <w:nsid w:val="6B1006A7"/>
     <w:multiLevelType w:val="hybridMultilevel"/>
     <w:tmpl w:val="AE8CBE64"/>
@@ -10043,7 +9609,7 @@
       </w:rPr>
     </w:lvl>
   </w:abstractNum>
-  <w:abstractNum w:abstractNumId="63" w15:restartNumberingAfterBreak="0">
+  <w:abstractNum w:abstractNumId="66" w15:restartNumberingAfterBreak="0">
     <w:nsid w:val="6C0F5B2A"/>
     <w:multiLevelType w:val="hybridMultilevel"/>
     <w:tmpl w:val="24982584"/>
@@ -10156,7 +9722,7 @@
       </w:rPr>
     </w:lvl>
   </w:abstractNum>
-  <w:abstractNum w:abstractNumId="64" w15:restartNumberingAfterBreak="0">
+  <w:abstractNum w:abstractNumId="67" w15:restartNumberingAfterBreak="0">
     <w:nsid w:val="6D954574"/>
     <w:multiLevelType w:val="multilevel"/>
     <w:tmpl w:val="63041800"/>
@@ -10305,7 +9871,7 @@
       </w:rPr>
     </w:lvl>
   </w:abstractNum>
-  <w:abstractNum w:abstractNumId="65" w15:restartNumberingAfterBreak="0">
+  <w:abstractNum w:abstractNumId="68" w15:restartNumberingAfterBreak="0">
     <w:nsid w:val="6DEF34B5"/>
     <w:multiLevelType w:val="hybridMultilevel"/>
     <w:tmpl w:val="89449340"/>
@@ -10418,7 +9984,7 @@
       </w:rPr>
     </w:lvl>
   </w:abstractNum>
-  <w:abstractNum w:abstractNumId="66" w15:restartNumberingAfterBreak="0">
+  <w:abstractNum w:abstractNumId="69" w15:restartNumberingAfterBreak="0">
     <w:nsid w:val="6E951D14"/>
     <w:multiLevelType w:val="hybridMultilevel"/>
     <w:tmpl w:val="8ED0260A"/>
@@ -10531,7 +10097,7 @@
       </w:rPr>
     </w:lvl>
   </w:abstractNum>
-  <w:abstractNum w:abstractNumId="67" w15:restartNumberingAfterBreak="0">
+  <w:abstractNum w:abstractNumId="70" w15:restartNumberingAfterBreak="0">
     <w:nsid w:val="6EF50D14"/>
     <w:multiLevelType w:val="hybridMultilevel"/>
     <w:tmpl w:val="B0288940"/>
@@ -10644,7 +10210,7 @@
       </w:rPr>
     </w:lvl>
   </w:abstractNum>
-  <w:abstractNum w:abstractNumId="68" w15:restartNumberingAfterBreak="0">
+  <w:abstractNum w:abstractNumId="71" w15:restartNumberingAfterBreak="0">
     <w:nsid w:val="6F48731A"/>
     <w:multiLevelType w:val="hybridMultilevel"/>
     <w:tmpl w:val="E5B266B6"/>
@@ -10757,7 +10323,7 @@
       </w:rPr>
     </w:lvl>
   </w:abstractNum>
-  <w:abstractNum w:abstractNumId="69" w15:restartNumberingAfterBreak="0">
+  <w:abstractNum w:abstractNumId="72" w15:restartNumberingAfterBreak="0">
     <w:nsid w:val="7007092B"/>
     <w:multiLevelType w:val="hybridMultilevel"/>
     <w:tmpl w:val="D07CD724"/>
@@ -10870,7 +10436,7 @@
       </w:rPr>
     </w:lvl>
   </w:abstractNum>
-  <w:abstractNum w:abstractNumId="70" w15:restartNumberingAfterBreak="0">
+  <w:abstractNum w:abstractNumId="73" w15:restartNumberingAfterBreak="0">
     <w:nsid w:val="70F24CA0"/>
     <w:multiLevelType w:val="hybridMultilevel"/>
     <w:tmpl w:val="925688D4"/>
@@ -10983,7 +10549,7 @@
       </w:rPr>
     </w:lvl>
   </w:abstractNum>
-  <w:abstractNum w:abstractNumId="71" w15:restartNumberingAfterBreak="0">
+  <w:abstractNum w:abstractNumId="74" w15:restartNumberingAfterBreak="0">
     <w:nsid w:val="781A4E3B"/>
     <w:multiLevelType w:val="hybridMultilevel"/>
     <w:tmpl w:val="C5E0AF44"/>
@@ -11096,7 +10662,7 @@
       </w:rPr>
     </w:lvl>
   </w:abstractNum>
-  <w:abstractNum w:abstractNumId="72" w15:restartNumberingAfterBreak="0">
+  <w:abstractNum w:abstractNumId="75" w15:restartNumberingAfterBreak="0">
     <w:nsid w:val="7AC773DB"/>
     <w:multiLevelType w:val="hybridMultilevel"/>
     <w:tmpl w:val="F75872D6"/>
@@ -11209,7 +10775,7 @@
       </w:rPr>
     </w:lvl>
   </w:abstractNum>
-  <w:abstractNum w:abstractNumId="73" w15:restartNumberingAfterBreak="0">
+  <w:abstractNum w:abstractNumId="76" w15:restartNumberingAfterBreak="0">
     <w:nsid w:val="7E4A26D7"/>
     <w:multiLevelType w:val="hybridMultilevel"/>
     <w:tmpl w:val="5BA2B582"/>
@@ -11322,7 +10888,7 @@
       </w:rPr>
     </w:lvl>
   </w:abstractNum>
-  <w:abstractNum w:abstractNumId="74" w15:restartNumberingAfterBreak="0">
+  <w:abstractNum w:abstractNumId="77" w15:restartNumberingAfterBreak="0">
     <w:nsid w:val="7E8177AF"/>
     <w:multiLevelType w:val="hybridMultilevel"/>
     <w:tmpl w:val="7E8A0AFA"/>
@@ -11435,7 +11001,7 @@
       </w:rPr>
     </w:lvl>
   </w:abstractNum>
-  <w:abstractNum w:abstractNumId="75" w15:restartNumberingAfterBreak="0">
+  <w:abstractNum w:abstractNumId="78" w15:restartNumberingAfterBreak="0">
     <w:nsid w:val="7EC655E7"/>
     <w:multiLevelType w:val="multilevel"/>
     <w:tmpl w:val="9B72CCB0"/>
@@ -11585,19 +11151,19 @@
     </w:lvl>
   </w:abstractNum>
   <w:num w:numId="1" w16cid:durableId="2054233651">
-    <w:abstractNumId w:val="29"/>
+    <w:abstractNumId w:val="30"/>
   </w:num>
   <w:num w:numId="2" w16cid:durableId="312292600">
-    <w:abstractNumId w:val="56"/>
+    <w:abstractNumId w:val="59"/>
   </w:num>
   <w:num w:numId="3" w16cid:durableId="1365054435">
     <w:abstractNumId w:val="14"/>
   </w:num>
   <w:num w:numId="4" w16cid:durableId="1628077389">
-    <w:abstractNumId w:val="46"/>
+    <w:abstractNumId w:val="48"/>
   </w:num>
   <w:num w:numId="5" w16cid:durableId="1983347719">
-    <w:abstractNumId w:val="71"/>
+    <w:abstractNumId w:val="74"/>
   </w:num>
   <w:num w:numId="6" w16cid:durableId="1065952712">
     <w:abstractNumId w:val="12"/>
@@ -11609,7 +11175,7 @@
     <w:abstractNumId w:val="0"/>
   </w:num>
   <w:num w:numId="9" w16cid:durableId="656306284">
-    <w:abstractNumId w:val="28"/>
+    <w:abstractNumId w:val="29"/>
   </w:num>
   <w:num w:numId="10" w16cid:durableId="1897080301">
     <w:abstractNumId w:val="13"/>
@@ -11618,16 +11184,16 @@
     <w:abstractNumId w:val="18"/>
   </w:num>
   <w:num w:numId="12" w16cid:durableId="1120878775">
+    <w:abstractNumId w:val="60"/>
+  </w:num>
+  <w:num w:numId="13" w16cid:durableId="1154179998">
+    <w:abstractNumId w:val="64"/>
+  </w:num>
+  <w:num w:numId="14" w16cid:durableId="1679041960">
     <w:abstractNumId w:val="57"/>
   </w:num>
-  <w:num w:numId="13" w16cid:durableId="1154179998">
-    <w:abstractNumId w:val="61"/>
-  </w:num>
-  <w:num w:numId="14" w16cid:durableId="1679041960">
-    <w:abstractNumId w:val="54"/>
-  </w:num>
   <w:num w:numId="15" w16cid:durableId="1090349956">
-    <w:abstractNumId w:val="60"/>
+    <w:abstractNumId w:val="63"/>
   </w:num>
   <w:num w:numId="16" w16cid:durableId="1317999520">
     <w:abstractNumId w:val="17"/>
@@ -11639,10 +11205,10 @@
     <w:abstractNumId w:val="5"/>
   </w:num>
   <w:num w:numId="19" w16cid:durableId="1721131486">
-    <w:abstractNumId w:val="55"/>
+    <w:abstractNumId w:val="58"/>
   </w:num>
   <w:num w:numId="20" w16cid:durableId="325598955">
-    <w:abstractNumId w:val="75"/>
+    <w:abstractNumId w:val="78"/>
   </w:num>
   <w:num w:numId="21" w16cid:durableId="542133106">
     <w:abstractNumId w:val="9"/>
@@ -11651,88 +11217,88 @@
     <w:abstractNumId w:val="4"/>
   </w:num>
   <w:num w:numId="23" w16cid:durableId="844520474">
-    <w:abstractNumId w:val="36"/>
+    <w:abstractNumId w:val="38"/>
   </w:num>
   <w:num w:numId="24" w16cid:durableId="1726298837">
-    <w:abstractNumId w:val="30"/>
+    <w:abstractNumId w:val="32"/>
   </w:num>
   <w:num w:numId="25" w16cid:durableId="67459506">
-    <w:abstractNumId w:val="43"/>
+    <w:abstractNumId w:val="45"/>
   </w:num>
   <w:num w:numId="26" w16cid:durableId="951017662">
     <w:abstractNumId w:val="24"/>
   </w:num>
   <w:num w:numId="27" w16cid:durableId="1066609688">
-    <w:abstractNumId w:val="42"/>
+    <w:abstractNumId w:val="44"/>
   </w:num>
   <w:num w:numId="28" w16cid:durableId="618728664">
-    <w:abstractNumId w:val="70"/>
+    <w:abstractNumId w:val="73"/>
   </w:num>
   <w:num w:numId="29" w16cid:durableId="2079552048">
-    <w:abstractNumId w:val="62"/>
+    <w:abstractNumId w:val="65"/>
   </w:num>
   <w:num w:numId="30" w16cid:durableId="416094391">
-    <w:abstractNumId w:val="49"/>
+    <w:abstractNumId w:val="52"/>
   </w:num>
   <w:num w:numId="31" w16cid:durableId="332686357">
-    <w:abstractNumId w:val="45"/>
+    <w:abstractNumId w:val="47"/>
   </w:num>
   <w:num w:numId="32" w16cid:durableId="1606578369">
-    <w:abstractNumId w:val="73"/>
+    <w:abstractNumId w:val="76"/>
   </w:num>
   <w:num w:numId="33" w16cid:durableId="1138645996">
-    <w:abstractNumId w:val="38"/>
+    <w:abstractNumId w:val="40"/>
   </w:num>
   <w:num w:numId="34" w16cid:durableId="552542610">
     <w:abstractNumId w:val="23"/>
   </w:num>
   <w:num w:numId="35" w16cid:durableId="605307484">
-    <w:abstractNumId w:val="74"/>
+    <w:abstractNumId w:val="77"/>
   </w:num>
   <w:num w:numId="36" w16cid:durableId="1538394760">
-    <w:abstractNumId w:val="33"/>
+    <w:abstractNumId w:val="35"/>
   </w:num>
   <w:num w:numId="37" w16cid:durableId="164244498">
-    <w:abstractNumId w:val="69"/>
+    <w:abstractNumId w:val="72"/>
   </w:num>
   <w:num w:numId="38" w16cid:durableId="372968038">
     <w:abstractNumId w:val="8"/>
   </w:num>
   <w:num w:numId="39" w16cid:durableId="1055202595">
-    <w:abstractNumId w:val="63"/>
+    <w:abstractNumId w:val="66"/>
   </w:num>
   <w:num w:numId="40" w16cid:durableId="136993273">
-    <w:abstractNumId w:val="65"/>
+    <w:abstractNumId w:val="68"/>
   </w:num>
   <w:num w:numId="41" w16cid:durableId="1357122748">
-    <w:abstractNumId w:val="32"/>
+    <w:abstractNumId w:val="34"/>
   </w:num>
   <w:num w:numId="42" w16cid:durableId="2009938108">
-    <w:abstractNumId w:val="40"/>
+    <w:abstractNumId w:val="42"/>
   </w:num>
   <w:num w:numId="43" w16cid:durableId="555168314">
     <w:abstractNumId w:val="10"/>
   </w:num>
   <w:num w:numId="44" w16cid:durableId="385227616">
-    <w:abstractNumId w:val="58"/>
+    <w:abstractNumId w:val="61"/>
   </w:num>
   <w:num w:numId="45" w16cid:durableId="1703937692">
     <w:abstractNumId w:val="25"/>
   </w:num>
   <w:num w:numId="46" w16cid:durableId="208341628">
-    <w:abstractNumId w:val="64"/>
+    <w:abstractNumId w:val="67"/>
   </w:num>
   <w:num w:numId="47" w16cid:durableId="411388373">
-    <w:abstractNumId w:val="52"/>
+    <w:abstractNumId w:val="55"/>
   </w:num>
   <w:num w:numId="48" w16cid:durableId="200553864">
-    <w:abstractNumId w:val="37"/>
+    <w:abstractNumId w:val="39"/>
   </w:num>
   <w:num w:numId="49" w16cid:durableId="494953586">
-    <w:abstractNumId w:val="51"/>
+    <w:abstractNumId w:val="54"/>
   </w:num>
   <w:num w:numId="50" w16cid:durableId="1454786748">
-    <w:abstractNumId w:val="41"/>
+    <w:abstractNumId w:val="43"/>
   </w:num>
   <w:num w:numId="51" w16cid:durableId="1496456066">
     <w:abstractNumId w:val="21"/>
@@ -11741,16 +11307,16 @@
     <w:abstractNumId w:val="7"/>
   </w:num>
   <w:num w:numId="53" w16cid:durableId="950161602">
-    <w:abstractNumId w:val="39"/>
+    <w:abstractNumId w:val="41"/>
   </w:num>
   <w:num w:numId="54" w16cid:durableId="340399104">
-    <w:abstractNumId w:val="50"/>
+    <w:abstractNumId w:val="53"/>
   </w:num>
   <w:num w:numId="55" w16cid:durableId="1332831189">
     <w:abstractNumId w:val="22"/>
   </w:num>
   <w:num w:numId="56" w16cid:durableId="1523399218">
-    <w:abstractNumId w:val="48"/>
+    <w:abstractNumId w:val="51"/>
   </w:num>
   <w:num w:numId="57" w16cid:durableId="1128546949">
     <w:abstractNumId w:val="11"/>
@@ -11759,34 +11325,34 @@
     <w:abstractNumId w:val="16"/>
   </w:num>
   <w:num w:numId="59" w16cid:durableId="101922618">
-    <w:abstractNumId w:val="68"/>
+    <w:abstractNumId w:val="71"/>
   </w:num>
   <w:num w:numId="60" w16cid:durableId="1231959776">
-    <w:abstractNumId w:val="67"/>
+    <w:abstractNumId w:val="70"/>
   </w:num>
   <w:num w:numId="61" w16cid:durableId="772095171">
-    <w:abstractNumId w:val="35"/>
+    <w:abstractNumId w:val="37"/>
   </w:num>
   <w:num w:numId="62" w16cid:durableId="762070812">
-    <w:abstractNumId w:val="44"/>
+    <w:abstractNumId w:val="46"/>
   </w:num>
   <w:num w:numId="63" w16cid:durableId="997729858">
-    <w:abstractNumId w:val="53"/>
+    <w:abstractNumId w:val="56"/>
   </w:num>
   <w:num w:numId="64" w16cid:durableId="538475048">
-    <w:abstractNumId w:val="27"/>
+    <w:abstractNumId w:val="28"/>
   </w:num>
   <w:num w:numId="65" w16cid:durableId="71437828">
-    <w:abstractNumId w:val="59"/>
+    <w:abstractNumId w:val="62"/>
   </w:num>
   <w:num w:numId="66" w16cid:durableId="1802725463">
     <w:abstractNumId w:val="26"/>
   </w:num>
   <w:num w:numId="67" w16cid:durableId="567615312">
-    <w:abstractNumId w:val="66"/>
+    <w:abstractNumId w:val="69"/>
   </w:num>
   <w:num w:numId="68" w16cid:durableId="153645479">
-    <w:abstractNumId w:val="47"/>
+    <w:abstractNumId w:val="50"/>
   </w:num>
   <w:num w:numId="69" w16cid:durableId="787503526">
     <w:abstractNumId w:val="2"/>
@@ -11795,13 +11361,13 @@
     <w:abstractNumId w:val="6"/>
   </w:num>
   <w:num w:numId="71" w16cid:durableId="140776019">
-    <w:abstractNumId w:val="34"/>
+    <w:abstractNumId w:val="36"/>
   </w:num>
   <w:num w:numId="72" w16cid:durableId="1073502114">
-    <w:abstractNumId w:val="31"/>
+    <w:abstractNumId w:val="33"/>
   </w:num>
   <w:num w:numId="73" w16cid:durableId="948051282">
-    <w:abstractNumId w:val="72"/>
+    <w:abstractNumId w:val="75"/>
   </w:num>
   <w:num w:numId="74" w16cid:durableId="1840150696">
     <w:abstractNumId w:val="15"/>
@@ -11811,6 +11377,15 @@
   </w:num>
   <w:num w:numId="76" w16cid:durableId="800416083">
     <w:abstractNumId w:val="3"/>
+  </w:num>
+  <w:num w:numId="77" w16cid:durableId="1259557157">
+    <w:abstractNumId w:val="31"/>
+  </w:num>
+  <w:num w:numId="78" w16cid:durableId="978458246">
+    <w:abstractNumId w:val="49"/>
+  </w:num>
+  <w:num w:numId="79" w16cid:durableId="1810315745">
+    <w:abstractNumId w:val="27"/>
   </w:num>
 </w:numbering>
 </file>

</xml_diff>